<commit_message>
docs: confirming eval 92.6% in D15 with per-fix attribution; fraud agent design
</commit_message>
<xml_diff>
--- a/docs/Development_Journal.docx
+++ b/docs/Development_Journal.docx
@@ -4785,7 +4785,7 @@
         <w:rPr>
           <w:i w:val="0"/>
         </w:rPr>
-        <w:t>Latest complete measurement (30/9, 27 cases: 14 dev + 13 held-out, Cerebras gpt-oss-120b, one run each):</w:t>
+        <w:t>Confirming run (1/10 evening, 27 cases: 14 dev + 13 held-out, Cerebras gpt-oss-120b, one run each, final code):</w:t>
       </w:r>
     </w:p>
     <w:tbl>
@@ -4887,12 +4887,13 @@
             <w:tcW w:type="dxa" w:w="3009"/>
           </w:tcPr>
           <w:p>
-            <w:r/>
-            <w:r>
-              <w:rPr>
-                <w:sz w:val="19"/>
-              </w:rPr>
-              <w:t>74% (dev 86%, held-out 62%)</w:t>
+            <w:r>
+              <w:t>93% (25/27; dev 100%, held-out 85%)</w:t>
+            </w:r>
+            <w:r>
+              <w:rPr>
+                <w:sz w:val="19"/>
+              </w:rPr>
             </w:r>
           </w:p>
         </w:tc>
@@ -4931,12 +4932,13 @@
             <w:tcW w:type="dxa" w:w="3009"/>
           </w:tcPr>
           <w:p>
-            <w:r/>
-            <w:r>
-              <w:rPr>
-                <w:sz w:val="19"/>
-              </w:rPr>
-              <w:t>68%</w:t>
+            <w:r>
+              <w:t>91% (20/22)</w:t>
+            </w:r>
+            <w:r>
+              <w:rPr>
+                <w:sz w:val="19"/>
+              </w:rPr>
             </w:r>
           </w:p>
         </w:tc>
@@ -5283,12 +5285,13 @@
             <w:tcW w:type="dxa" w:w="3009"/>
           </w:tcPr>
           <w:p>
-            <w:r/>
-            <w:r>
-              <w:rPr>
-                <w:sz w:val="19"/>
-              </w:rPr>
-              <w:t>median 91 s (12 s compute; the rest is free-tier pacing)</w:t>
+            <w:r>
+              <w:t>median 91 s (10 s compute; the rest is free-tier pacing)</w:t>
+            </w:r>
+            <w:r>
+              <w:rPr>
+                <w:sz w:val="19"/>
+              </w:rPr>
             </w:r>
           </w:p>
         </w:tc>
@@ -5327,12 +5330,13 @@
             <w:tcW w:type="dxa" w:w="3009"/>
           </w:tcPr>
           <w:p>
-            <w:r/>
-            <w:r>
-              <w:rPr>
-                <w:sz w:val="19"/>
-              </w:rPr>
-              <w:t>about US$0.009 (~20k tokens)</w:t>
+            <w:r>
+              <w:t>about US$0.011 (~25k tokens)</w:t>
+            </w:r>
+            <w:r>
+              <w:rPr>
+                <w:sz w:val="19"/>
+              </w:rPr>
             </w:r>
           </w:p>
         </w:tc>
@@ -5345,7 +5349,7 @@
         <w:rPr>
           <w:i w:val="0"/>
         </w:rPr>
-        <w:t>The 1/10 run with the Case Brief scored 63% because of the integration gap in Iteration 9. Replaying its 27 recorded rulings through the fixes gives 25/27 (93%), with the two remaining Judge errors routed to a person rather than executed. These numbers are a projection until the confirming run; stability (three runs per case) is also still to be measured.</w:t>
+        <w:t>The earlier 1/10 run with the Case Brief scored 63% because of the integration gap in Iteration 9. Replaying its rulings through the fixes projected 25/27, and the confirming run scored exactly 25/27. The two misses (NS-002-B1 and NS-002-C1) are Judge reasoning errors on no-show fees; the deterministic fee-basis check sends both to a person instead of executing them. Paraphrase and injection checks all passed; one of three counterfactual checks failed (NS-002-C1). Stability (three runs per case) is still to be measured.</w:t>
       </w:r>
     </w:p>
     <w:p>
@@ -5453,7 +5457,7 @@
         <w:pStyle w:val="ListParagraph"/>
       </w:pPr>
       <w:r>
-        <w:t>•  Confirming run and stability measurement (three runs per case); a single-call baseline to show what the multi-agent design buys.</w:t>
+        <w:t>•  Stability measurement (three runs per case) and a single-call baseline to show what the multi-agent design buys; fix the Judge’s no-show fee reasoning (NS-002-B1/C1) rather than only catching it.</w:t>
       </w:r>
     </w:p>
     <w:p>

</xml_diff>

<commit_message>
docs: stability run 24/24 and new held-out baseline 3/6 (refunds 6/6) in D15 and journal
</commit_message>
<xml_diff>
--- a/docs/Development_Journal.docx
+++ b/docs/Development_Journal.docx
@@ -5349,7 +5349,16 @@
         <w:rPr>
           <w:i w:val="0"/>
         </w:rPr>
-        <w:t>The earlier 1/10 run with the Case Brief scored 63% because of the integration gap in Iteration 9. Replaying its rulings through the fixes projected 25/27, and the confirming run scored exactly 25/27. The two misses (NS-002-B1 and NS-002-C1) are Judge reasoning errors on no-show fees; the deterministic fee-basis check sends both to a person instead of executing them. Paraphrase and injection checks all passed; one of three counterfactual checks failed (NS-002-C1). Stability (three runs per case) is still to be measured.</w:t>
+        <w:t>The earlier 1/10 run with the Case Brief scored 63% because of the integration gap in Iteration 9. Replaying its rulings through the fixes projected 25/27, and the confirming run scored exactly 25/27. The two misses (NS-002-B1 and NS-002-C1) are Judge reasoning errors on no-show fees; the deterministic fee-basis check sends both to a person instead of executing them. Paraphrase and injection checks all passed; one of three counterfactual checks failed (NS-002-C1). A stability run on 2/10 repeated the eight cases that had flipped between earlier runs three times each: 24/24 verdicts and refunds correct, consistency 1.0.</w:t>
+      </w:r>
+    </w:p>
+    <w:p>
+      <w:pPr/>
+      <w:r>
+        <w:rPr>
+          <w:i w:val="0"/>
+        </w:rPr>
+        <w:t>Six new held-out cases were then written that the code had never been tuned on (two-ask filings, a GPS gap on a metered fare, a capped damage claim, a valid cleaning fee, a "coming in 2 min" message, a promo already returned). Baseline: 3/6 verdicts correct, but all six refunds were right. Two misses are labels on two-ask filings (upheld instead of partially_upheld, one caused by our own label rule) and one is a fare dispute with a GPS gap that should have gone to a person; our GPS-gap check only covered no-show, cancellation and route disputes. The answer keys are being checked by a person before these are fixed.</w:t>
       </w:r>
     </w:p>
     <w:p>
@@ -5457,7 +5466,7 @@
         <w:pStyle w:val="ListParagraph"/>
       </w:pPr>
       <w:r>
-        <w:t>•  Stability measurement (three runs per case) and a single-call baseline to show what the multi-agent design buys; fix the Judge’s no-show fee reasoning (NS-002-B1/C1) rather than only catching it.</w:t>
+        <w:t>•  A single-call baseline to show what the multi-agent design buys; fix the Judge’s no-show fee reasoning (NS-002-B1/C1) rather than only catching it; handle two-ask filings in the label rule and extend the GPS-gap check to metered fares.</w:t>
       </w:r>
     </w:p>
     <w:p>

</xml_diff>

<commit_message>
docs: bring README, development log, next steps, eval plan and Development Journal up to 2026-10-05; mark 2026-09-21 planning docs as historical
</commit_message>
<xml_diff>
--- a/docs/Development_Journal.docx
+++ b/docs/Development_Journal.docx
@@ -16,7 +16,7 @@
         <w:rPr>
           <w:i/>
         </w:rPr>
-        <w:t>Multi-agent dispute resolution for the Ryde platform. Development report covering 18 September – 1 October 2026.</w:t>
+        <w:t>Multi-agent dispute resolution for the Ryde platform. Development report covering 18 September – 5 October 2026.</w:t>
       </w:r>
     </w:p>
     <w:p>
@@ -91,25 +91,21 @@
         <w:rPr>
           <w:b/>
         </w:rPr>
-        <w:t xml:space="preserve">•  Development period: </w:t>
-      </w:r>
-      <w:r>
-        <w:t>18/9/2026 – 1/10/2026 (submission deadline 16/10/2026)</w:t>
-      </w:r>
-    </w:p>
-    <w:p>
-      <w:pPr>
-        <w:pStyle w:val="ListParagraph"/>
-      </w:pPr>
-      <w:r>
-        <w:rPr>
-          <w:b/>
-        </w:rPr>
-        <w:t xml:space="preserve">•  Main technologies: </w:t>
-      </w:r>
-      <w:r>
-        <w:t>Python 3.13, FastAPI, LangGraph, Pydantic; LLMs: Google Gemini 2.5 Flash (first week), Groq and Cerebras gpt-oss-120b (evaluation); Qdrant Cloud hybrid search (BAAI/bge-base-en-v1.5 dense + BM25, fastembed) with local ChromaDB for tests; SQLite for rulings and audit log; Pytest; CodeBuddy; Tencent ADP (policy Q&amp;A, auxiliary).</w:t>
-      </w:r>
+        <w:t>•  Development period: 18/9/2026 – 5/10/2026 (submission deadline 16/10/2026)</w:t>
+      </w:r>
+      <w:r/>
+    </w:p>
+    <w:p>
+      <w:pPr>
+        <w:pStyle w:val="ListParagraph"/>
+      </w:pPr>
+      <w:r>
+        <w:rPr>
+          <w:b/>
+        </w:rPr>
+        <w:t>•  Main technologies: Python 3.13, FastAPI, LangGraph, Pydantic; LLMs: Google Gemini 2.5 Flash (first week), Groq and Cerebras gpt-oss-120b (evaluation); Qdrant Cloud hybrid search (BAAI/bge-base-en-v1.5 dense + BM25, fastembed) with local ChromaDB for tests; SQLite locally and Supabase Postgres for rulings, traces, rider/driver history and the audit log; Pytest; CodeBuddy; Tencent ADP (policy Q&amp;A, auxiliary).</w:t>
+      </w:r>
+      <w:r/>
     </w:p>
     <w:p>
       <w:pPr>
@@ -1518,13 +1514,388 @@
         <w:rPr>
           <w:b/>
         </w:rPr>
-        <w:t xml:space="preserve">Result: </w:t>
-      </w:r>
-      <w:r>
-        <w:rPr>
-          <w:i w:val="0"/>
-        </w:rPr>
-        <w:t>Replayed on the recorded rulings, the fixes give 25/27; a confirming run is next (Iteration 9).</w:t>
+        <w:t>Result: Replayed on the recorded rulings, the fixes give 25/27; the confirming run scored exactly 25/27 (Iteration 9).</w:t>
+      </w:r>
+      <w:r>
+        <w:rPr>
+          <w:i w:val="0"/>
+        </w:rPr>
+      </w:r>
+    </w:p>
+    <w:p>
+      <w:pPr>
+        <w:pStyle w:val="Heading3"/>
+      </w:pPr>
+      <w:r>
+        <w:t>Day 11 — Labels from the asks, overfitting rules</w:t>
+      </w:r>
+    </w:p>
+    <w:p>
+      <w:pPr/>
+      <w:r>
+        <w:rPr>
+          <w:b/>
+        </w:rPr>
+        <w:t>Date: 2/10/2026</w:t>
+      </w:r>
+      <w:r>
+        <w:rPr>
+          <w:i w:val="0"/>
+        </w:rPr>
+      </w:r>
+    </w:p>
+    <w:p>
+      <w:pPr/>
+      <w:r>
+        <w:rPr>
+          <w:b/>
+        </w:rPr>
+        <w:t>Objective: Fix the label errors of the confirming run without tuning to individual cases.</w:t>
+      </w:r>
+      <w:r>
+        <w:rPr>
+          <w:i w:val="0"/>
+        </w:rPr>
+      </w:r>
+    </w:p>
+    <w:p>
+      <w:pPr/>
+      <w:r>
+        <w:rPr>
+          <w:b/>
+          <w:i w:val="0"/>
+        </w:rPr>
+        <w:t>Work completed:</w:t>
+      </w:r>
+    </w:p>
+    <w:p>
+      <w:pPr>
+        <w:pStyle w:val="ListParagraph"/>
+      </w:pPr>
+      <w:r>
+        <w:t>•  (billy) The Judge lists every ask with an outcome; the verdict label is computed from that list.</w:t>
+      </w:r>
+    </w:p>
+    <w:p>
+      <w:pPr>
+        <w:pStyle w:val="ListParagraph"/>
+      </w:pPr>
+      <w:r>
+        <w:t>•  (billy) A GPS gap now also blocks a metered fare dispute; an upfront fare stays automatic.</w:t>
+      </w:r>
+    </w:p>
+    <w:p>
+      <w:pPr>
+        <w:pStyle w:val="ListParagraph"/>
+      </w:pPr>
+      <w:r>
+        <w:t>•  (billy) Overfitting protocol: fix the rule not the case, test each rule in both directions, replay recorded rulings before a re-run, and keep a sealed set for one final run.</w:t>
+      </w:r>
+    </w:p>
+    <w:p>
+      <w:pPr/>
+      <w:r>
+        <w:rPr>
+          <w:b/>
+          <w:i w:val="0"/>
+        </w:rPr>
+        <w:t>Problems encountered:</w:t>
+      </w:r>
+    </w:p>
+    <w:p>
+      <w:pPr>
+        <w:pStyle w:val="ListParagraph"/>
+      </w:pPr>
+      <w:r>
+        <w:t>•  17% of rebuttals were empty: gpt-oss spent the whole 300-token budget on hidden reasoning.</w:t>
+      </w:r>
+    </w:p>
+    <w:p>
+      <w:pPr/>
+      <w:r>
+        <w:rPr>
+          <w:b/>
+          <w:i w:val="0"/>
+        </w:rPr>
+        <w:t>What we did about it:</w:t>
+      </w:r>
+    </w:p>
+    <w:p>
+      <w:pPr>
+        <w:pStyle w:val="ListParagraph"/>
+      </w:pPr>
+      <w:r>
+        <w:t>•  Rebuttal budget raised to 1,500 tokens (the 180-word limit stays in the prompt), and a warning when a reply comes back empty.</w:t>
+      </w:r>
+    </w:p>
+    <w:p>
+      <w:pPr/>
+      <w:r>
+        <w:rPr>
+          <w:b/>
+        </w:rPr>
+        <w:t>Result: Full debates for the first time; every earlier number had been measured with some rebuttals missing.</w:t>
+      </w:r>
+      <w:r>
+        <w:rPr>
+          <w:i w:val="0"/>
+        </w:rPr>
+      </w:r>
+    </w:p>
+    <w:p>
+      <w:pPr>
+        <w:pStyle w:val="Heading3"/>
+      </w:pPr>
+      <w:r>
+        <w:t>Day 12 — Payout guards, Judge principles, Supabase</w:t>
+      </w:r>
+    </w:p>
+    <w:p>
+      <w:pPr/>
+      <w:r>
+        <w:rPr>
+          <w:b/>
+        </w:rPr>
+        <w:t>Date: 3–4/10/2026</w:t>
+      </w:r>
+      <w:r>
+        <w:rPr>
+          <w:i w:val="0"/>
+        </w:rPr>
+      </w:r>
+    </w:p>
+    <w:p>
+      <w:pPr/>
+      <w:r>
+        <w:rPr>
+          <w:b/>
+        </w:rPr>
+        <w:t>Objective: Make sure no wrong payout is executed automatically, and store records in a shared database.</w:t>
+      </w:r>
+      <w:r>
+        <w:rPr>
+          <w:i w:val="0"/>
+        </w:rPr>
+      </w:r>
+    </w:p>
+    <w:p>
+      <w:pPr/>
+      <w:r>
+        <w:rPr>
+          <w:b/>
+          <w:i w:val="0"/>
+        </w:rPr>
+        <w:t>Work completed:</w:t>
+      </w:r>
+    </w:p>
+    <w:p>
+      <w:pPr>
+        <w:pStyle w:val="ListParagraph"/>
+      </w:pPr>
+      <w:r>
+        <w:t>•  (billy) Two guards: a fee kept although the trip's delay waiver applies, and a refund larger than the disputed amount, both go to a person.</w:t>
+      </w:r>
+    </w:p>
+    <w:p>
+      <w:pPr>
+        <w:pStyle w:val="ListParagraph"/>
+      </w:pPr>
+      <w:r>
+        <w:t>•  (billy) Four general reasoning principles in the Judge prompt: rule conditions apply literally, every amount comes from a specific rule, an argument is not evidence, split the filing into its asks.</w:t>
+      </w:r>
+    </w:p>
+    <w:p>
+      <w:pPr>
+        <w:pStyle w:val="ListParagraph"/>
+      </w:pPr>
+      <w:r>
+        <w:t>•  (billy) A service-quality refund with no fare overcharge goes to a person (user decision: Ryde has no refund schedule for conduct).</w:t>
+      </w:r>
+    </w:p>
+    <w:p>
+      <w:pPr>
+        <w:pStyle w:val="ListParagraph"/>
+      </w:pPr>
+      <w:r>
+        <w:t>•  (billy) One notice per party, each stating its own outcome; both shown in the dashboard.</w:t>
+      </w:r>
+    </w:p>
+    <w:p>
+      <w:pPr>
+        <w:pStyle w:val="ListParagraph"/>
+      </w:pPr>
+      <w:r>
+        <w:t>•  (billy) Record store on Supabase Postgres; rider/driver history store (trips, disputes, outcomes, fraud flags); architecture diagram.</w:t>
+      </w:r>
+    </w:p>
+    <w:p>
+      <w:pPr/>
+      <w:r>
+        <w:rPr>
+          <w:b/>
+          <w:i w:val="0"/>
+        </w:rPr>
+        <w:t>Problems encountered:</w:t>
+      </w:r>
+    </w:p>
+    <w:p>
+      <w:pPr>
+        <w:pStyle w:val="ListParagraph"/>
+      </w:pPr>
+      <w:r>
+        <w:t>•  With full debates the score fell to 29/33: the driver's rebuttal now persuaded the Judge on a fee waiver the missing rebuttal had hidden.</w:t>
+      </w:r>
+    </w:p>
+    <w:p>
+      <w:pPr/>
+      <w:r>
+        <w:rPr>
+          <w:b/>
+          <w:i w:val="0"/>
+        </w:rPr>
+        <w:t>What we did about it:</w:t>
+      </w:r>
+    </w:p>
+    <w:p>
+      <w:pPr>
+        <w:pStyle w:val="ListParagraph"/>
+      </w:pPr>
+      <w:r>
+        <w:t>•  Guards rather than case-specific prompt lines; replayed over 140 recorded rulings, each fired only on the wrong ruling it was written for.</w:t>
+      </w:r>
+    </w:p>
+    <w:p>
+      <w:pPr/>
+      <w:r>
+        <w:rPr>
+          <w:b/>
+        </w:rPr>
+        <w:t>Result: 30/33 (D18), and every remaining miss goes to a person instead of paying out.</w:t>
+      </w:r>
+      <w:r>
+        <w:rPr>
+          <w:i w:val="0"/>
+        </w:rPr>
+      </w:r>
+    </w:p>
+    <w:p>
+      <w:pPr>
+        <w:pStyle w:val="Heading3"/>
+      </w:pPr>
+      <w:r>
+        <w:t>Day 13 — Provider fallback, regression run, merge</w:t>
+      </w:r>
+    </w:p>
+    <w:p>
+      <w:pPr/>
+      <w:r>
+        <w:rPr>
+          <w:b/>
+        </w:rPr>
+        <w:t>Date: 5/10/2026</w:t>
+      </w:r>
+      <w:r>
+        <w:rPr>
+          <w:i w:val="0"/>
+        </w:rPr>
+      </w:r>
+    </w:p>
+    <w:p>
+      <w:pPr/>
+      <w:r>
+        <w:rPr>
+          <w:b/>
+        </w:rPr>
+        <w:t>Objective: Check every change since Day 12 on the full set and bring main up to date.</w:t>
+      </w:r>
+      <w:r>
+        <w:rPr>
+          <w:i w:val="0"/>
+        </w:rPr>
+      </w:r>
+    </w:p>
+    <w:p>
+      <w:pPr/>
+      <w:r>
+        <w:rPr>
+          <w:b/>
+          <w:i w:val="0"/>
+        </w:rPr>
+        <w:t>Work completed:</w:t>
+      </w:r>
+    </w:p>
+    <w:p>
+      <w:pPr>
+        <w:pStyle w:val="ListParagraph"/>
+      </w:pPr>
+      <w:r>
+        <w:t>•  (billy) Backup chat providers tried in order (LLM_FALLBACK_PROVIDERS); evaluations turn it off so a run never mixes models.</w:t>
+      </w:r>
+    </w:p>
+    <w:p>
+      <w:pPr>
+        <w:pStyle w:val="ListParagraph"/>
+      </w:pPr>
+      <w:r>
+        <w:t>•  (billy) Tencent Hunyuan provider through TokenHub added and tested; Gemini 3.8 Flash and Groq piloted on five cases.</w:t>
+      </w:r>
+    </w:p>
+    <w:p>
+      <w:pPr>
+        <w:pStyle w:val="ListParagraph"/>
+      </w:pPr>
+      <w:r>
+        <w:t>•  (billy) Full regression run and merge of the branch into main (PR #18); README and documents updated.</w:t>
+      </w:r>
+    </w:p>
+    <w:p>
+      <w:pPr/>
+      <w:r>
+        <w:rPr>
+          <w:b/>
+          <w:i w:val="0"/>
+        </w:rPr>
+        <w:t>Problems encountered:</w:t>
+      </w:r>
+    </w:p>
+    <w:p>
+      <w:pPr>
+        <w:pStyle w:val="ListParagraph"/>
+      </w:pPr>
+      <w:r>
+        <w:t>•  TokenHub needs a paid inference service (402 on every model); Gemini's free tier allows 20 requests a day; Groq's free tier rejects single requests over 8,000 tokens.</w:t>
+      </w:r>
+    </w:p>
+    <w:p>
+      <w:pPr/>
+      <w:r>
+        <w:rPr>
+          <w:b/>
+          <w:i w:val="0"/>
+        </w:rPr>
+        <w:t>What we did about it:</w:t>
+      </w:r>
+    </w:p>
+    <w:p>
+      <w:pPr>
+        <w:pStyle w:val="ListParagraph"/>
+      </w:pPr>
+      <w:r>
+        <w:t>•  Evaluations stay on Cerebras gpt-oss-120b, the same model the demo uses; the Hunyuan code stays for later.</w:t>
+      </w:r>
+    </w:p>
+    <w:p>
+      <w:pPr/>
+      <w:r>
+        <w:rPr>
+          <w:b/>
+        </w:rPr>
+        <w:t>Result: 31/33 (93.9%), 0 failed runs, US$0.37 for the full run (Iteration 12).</w:t>
+      </w:r>
+      <w:r>
+        <w:rPr>
+          <w:i w:val="0"/>
+        </w:rPr>
       </w:r>
     </w:p>
     <w:p>
@@ -2363,12 +2734,334 @@
             <w:tcW w:type="dxa" w:w="1289"/>
           </w:tcPr>
           <w:p>
-            <w:r/>
-            <w:r>
-              <w:rPr>
-                <w:sz w:val="19"/>
-              </w:rPr>
-              <w:t>Confirming run pending</w:t>
+            <w:r>
+              <w:t>Confirmed 25/27</w:t>
+            </w:r>
+            <w:r>
+              <w:rPr>
+                <w:sz w:val="19"/>
+              </w:rPr>
+            </w:r>
+          </w:p>
+        </w:tc>
+      </w:tr>
+      <w:tr>
+        <w:tc>
+          <w:tcPr>
+            <w:tcW w:type="dxa" w:w="1289"/>
+          </w:tcPr>
+          <w:p>
+            <w:r>
+              <w:t>10. Labels from asks</w:t>
+            </w:r>
+            <w:r>
+              <w:rPr>
+                <w:sz w:val="19"/>
+              </w:rPr>
+            </w:r>
+          </w:p>
+        </w:tc>
+        <w:tc>
+          <w:tcPr>
+            <w:tcW w:type="dxa" w:w="1289"/>
+          </w:tcPr>
+          <w:p>
+            <w:r>
+              <w:t>2/10</w:t>
+            </w:r>
+            <w:r>
+              <w:rPr>
+                <w:sz w:val="19"/>
+              </w:rPr>
+            </w:r>
+          </w:p>
+        </w:tc>
+        <w:tc>
+          <w:tcPr>
+            <w:tcW w:type="dxa" w:w="1289"/>
+          </w:tcPr>
+          <w:p>
+            <w:r>
+              <w:t>Ask-based labels, metered-fare GPS gap, full rebuttals</w:t>
+            </w:r>
+            <w:r>
+              <w:rPr>
+                <w:sz w:val="19"/>
+              </w:rPr>
+            </w:r>
+          </w:p>
+        </w:tc>
+        <w:tc>
+          <w:tcPr>
+            <w:tcW w:type="dxa" w:w="1289"/>
+          </w:tcPr>
+          <w:p>
+            <w:r>
+              <w:t>33</w:t>
+            </w:r>
+            <w:r>
+              <w:rPr>
+                <w:sz w:val="19"/>
+              </w:rPr>
+            </w:r>
+          </w:p>
+        </w:tc>
+        <w:tc>
+          <w:tcPr>
+            <w:tcW w:type="dxa" w:w="1289"/>
+          </w:tcPr>
+          <w:p>
+            <w:r>
+              <w:t>88% (29/33)</w:t>
+            </w:r>
+            <w:r>
+              <w:rPr>
+                <w:sz w:val="19"/>
+              </w:rPr>
+            </w:r>
+          </w:p>
+        </w:tc>
+        <w:tc>
+          <w:tcPr>
+            <w:tcW w:type="dxa" w:w="1289"/>
+          </w:tcPr>
+          <w:p>
+            <w:r>
+              <w:t>—</w:t>
+            </w:r>
+            <w:r>
+              <w:rPr>
+                <w:sz w:val="19"/>
+              </w:rPr>
+            </w:r>
+          </w:p>
+        </w:tc>
+        <w:tc>
+          <w:tcPr>
+            <w:tcW w:type="dxa" w:w="1289"/>
+          </w:tcPr>
+          <w:p>
+            <w:r>
+              <w:t>Full debates exposed a fee-waiver weakness</w:t>
+            </w:r>
+            <w:r>
+              <w:rPr>
+                <w:sz w:val="19"/>
+              </w:rPr>
+            </w:r>
+          </w:p>
+        </w:tc>
+      </w:tr>
+      <w:tr>
+        <w:tc>
+          <w:tcPr>
+            <w:tcW w:type="dxa" w:w="1289"/>
+          </w:tcPr>
+          <w:p>
+            <w:r>
+              <w:t>11. Guards + principles</w:t>
+            </w:r>
+            <w:r>
+              <w:rPr>
+                <w:sz w:val="19"/>
+              </w:rPr>
+            </w:r>
+          </w:p>
+        </w:tc>
+        <w:tc>
+          <w:tcPr>
+            <w:tcW w:type="dxa" w:w="1289"/>
+          </w:tcPr>
+          <w:p>
+            <w:r>
+              <w:t>4/10</w:t>
+            </w:r>
+            <w:r>
+              <w:rPr>
+                <w:sz w:val="19"/>
+              </w:rPr>
+            </w:r>
+          </w:p>
+        </w:tc>
+        <w:tc>
+          <w:tcPr>
+            <w:tcW w:type="dxa" w:w="1289"/>
+          </w:tcPr>
+          <w:p>
+            <w:r>
+              <w:t>Payout guards, Judge principles, discretionary refunds to a person</w:t>
+            </w:r>
+            <w:r>
+              <w:rPr>
+                <w:sz w:val="19"/>
+              </w:rPr>
+            </w:r>
+          </w:p>
+        </w:tc>
+        <w:tc>
+          <w:tcPr>
+            <w:tcW w:type="dxa" w:w="1289"/>
+          </w:tcPr>
+          <w:p>
+            <w:r>
+              <w:t>33</w:t>
+            </w:r>
+            <w:r>
+              <w:rPr>
+                <w:sz w:val="19"/>
+              </w:rPr>
+            </w:r>
+          </w:p>
+        </w:tc>
+        <w:tc>
+          <w:tcPr>
+            <w:tcW w:type="dxa" w:w="1289"/>
+          </w:tcPr>
+          <w:p>
+            <w:r>
+              <w:t>91% (30/33)</w:t>
+            </w:r>
+            <w:r>
+              <w:rPr>
+                <w:sz w:val="19"/>
+              </w:rPr>
+            </w:r>
+          </w:p>
+        </w:tc>
+        <w:tc>
+          <w:tcPr>
+            <w:tcW w:type="dxa" w:w="1289"/>
+          </w:tcPr>
+          <w:p>
+            <w:r>
+              <w:t>—</w:t>
+            </w:r>
+            <w:r>
+              <w:rPr>
+                <w:sz w:val="19"/>
+              </w:rPr>
+            </w:r>
+          </w:p>
+        </w:tc>
+        <w:tc>
+          <w:tcPr>
+            <w:tcW w:type="dxa" w:w="1289"/>
+          </w:tcPr>
+          <w:p>
+            <w:r>
+              <w:t>Every miss goes to a person</w:t>
+            </w:r>
+            <w:r>
+              <w:rPr>
+                <w:sz w:val="19"/>
+              </w:rPr>
+            </w:r>
+          </w:p>
+        </w:tc>
+      </w:tr>
+      <w:tr>
+        <w:tc>
+          <w:tcPr>
+            <w:tcW w:type="dxa" w:w="1289"/>
+          </w:tcPr>
+          <w:p>
+            <w:r>
+              <w:t>12. Regression</w:t>
+            </w:r>
+            <w:r>
+              <w:rPr>
+                <w:sz w:val="19"/>
+              </w:rPr>
+            </w:r>
+          </w:p>
+        </w:tc>
+        <w:tc>
+          <w:tcPr>
+            <w:tcW w:type="dxa" w:w="1289"/>
+          </w:tcPr>
+          <w:p>
+            <w:r>
+              <w:t>5/10</w:t>
+            </w:r>
+            <w:r>
+              <w:rPr>
+                <w:sz w:val="19"/>
+              </w:rPr>
+            </w:r>
+          </w:p>
+        </w:tc>
+        <w:tc>
+          <w:tcPr>
+            <w:tcW w:type="dxa" w:w="1289"/>
+          </w:tcPr>
+          <w:p>
+            <w:r>
+              <w:t>All changes since 11, Supabase store</w:t>
+            </w:r>
+            <w:r>
+              <w:rPr>
+                <w:sz w:val="19"/>
+              </w:rPr>
+            </w:r>
+          </w:p>
+        </w:tc>
+        <w:tc>
+          <w:tcPr>
+            <w:tcW w:type="dxa" w:w="1289"/>
+          </w:tcPr>
+          <w:p>
+            <w:r>
+              <w:t>33</w:t>
+            </w:r>
+            <w:r>
+              <w:rPr>
+                <w:sz w:val="19"/>
+              </w:rPr>
+            </w:r>
+          </w:p>
+        </w:tc>
+        <w:tc>
+          <w:tcPr>
+            <w:tcW w:type="dxa" w:w="1289"/>
+          </w:tcPr>
+          <w:p>
+            <w:r>
+              <w:t>94% (31/33)</w:t>
+            </w:r>
+            <w:r>
+              <w:rPr>
+                <w:sz w:val="19"/>
+              </w:rPr>
+            </w:r>
+          </w:p>
+        </w:tc>
+        <w:tc>
+          <w:tcPr>
+            <w:tcW w:type="dxa" w:w="1289"/>
+          </w:tcPr>
+          <w:p>
+            <w:r>
+              <w:t>93% (25/27)</w:t>
+            </w:r>
+            <w:r>
+              <w:rPr>
+                <w:sz w:val="19"/>
+              </w:rPr>
+            </w:r>
+          </w:p>
+        </w:tc>
+        <w:tc>
+          <w:tcPr>
+            <w:tcW w:type="dxa" w:w="1289"/>
+          </w:tcPr>
+          <w:p>
+            <w:r>
+              <w:t>0 failed runs, US$0.37</w:t>
+            </w:r>
+            <w:r>
+              <w:rPr>
+                <w:sz w:val="19"/>
+              </w:rPr>
             </w:r>
           </w:p>
         </w:tc>
@@ -2629,6 +3322,57 @@
           <w:i w:val="0"/>
         </w:rPr>
         <w:t>Fixes: Fairness accepts Case Brief clauses and is told what each verdict label means; the label follows the refund; a deterministic check (fee_basis_not_met) sends a kept fee to a person when the trip's data contradicts its basis. Replayed on all 27 recorded rulings, the label rule changes exactly the two mislabelled cases and the check flags exactly the two wrong rulings and no correct one: 25/27 projected, with the two Judge errors going to a person instead of being executed. The same day we cut prompts by about 21% (Passenger 2.9k → 2.3k tokens, Judge 5.7k → 4.5k) by replacing raw GPS points with the Case Brief's computed facts and sending clauses as compact text. A confirming run is scheduled after the provider's daily quota resets.</w:t>
+      </w:r>
+    </w:p>
+    <w:p>
+      <w:pPr>
+        <w:pStyle w:val="Heading3"/>
+      </w:pPr>
+      <w:r>
+        <w:t>Iteration 10 — Labels from the asks, full debates (2/10)</w:t>
+      </w:r>
+    </w:p>
+    <w:p>
+      <w:pPr/>
+      <w:r>
+        <w:rPr>
+          <w:i w:val="0"/>
+        </w:rPr>
+        <w:t>Two-ask filings were labelled wrong and 17% of rebuttals were empty. The label is now computed from the Judge's list of asks, and the rebuttal budget was raised. The full-debate run scored 29/33: a missing rebuttal had been helping the Judge on CR-001, so full debates exposed a real weakness on fee waivers.</w:t>
+      </w:r>
+    </w:p>
+    <w:p>
+      <w:pPr>
+        <w:pStyle w:val="Heading3"/>
+      </w:pPr>
+      <w:r>
+        <w:t>Iteration 11 — Guards and reasoning principles (4/10)</w:t>
+      </w:r>
+    </w:p>
+    <w:p>
+      <w:pPr/>
+      <w:r>
+        <w:rPr>
+          <w:i w:val="0"/>
+        </w:rPr>
+        <w:t>Instead of a prompt line for one case, two deterministic guards send contradicted payouts to a person, and four general principles were added to the Judge prompt. Run: 30/33, with NS-002-B1 correct for the first time. Discretionary service-quality refunds now go to a person.</w:t>
+      </w:r>
+    </w:p>
+    <w:p>
+      <w:pPr>
+        <w:pStyle w:val="Heading3"/>
+      </w:pPr>
+      <w:r>
+        <w:t>Iteration 12 — Regression run (5/10)</w:t>
+      </w:r>
+    </w:p>
+    <w:p>
+      <w:pPr/>
+      <w:r>
+        <w:rPr>
+          <w:i w:val="0"/>
+        </w:rPr>
+        <w:t>After the Day 12 changes only two cases had been re-run, so the whole set was run again: 31/33 (93.9%), dev 13/14, held-out 18/19, refund 25/27, 0 failed runs. RD-002 was lost to run-to-run variation (Fairness caught a contradiction in a correct ruling's reasons and sent it to a person); it was left unfixed on purpose, to avoid tuning to these 33 cases.</w:t>
       </w:r>
     </w:p>
     <w:p>
@@ -3473,7 +4217,7 @@
         <w:rPr>
           <w:i w:val="0"/>
         </w:rPr>
-        <w:t>Unit and integration tests: 325 passing (Pytest), covering every agent, the workflow routes, the Collector tools, retrieval ranking, the Case Brief, the guards and the evaluation scoring. The cases below are real end-to-end runs from the 1/10 evaluation (Cerebras gpt-oss-120b).</w:t>
+        <w:t>Unit and integration tests: 368 passing (Pytest), covering every agent, the workflow routes, the Collector tools, retrieval ranking, the Case Brief, the guards and the evaluation scoring. The cases below are real end-to-end runs from the 1/10 evaluation (Cerebras gpt-oss-120b).</w:t>
       </w:r>
     </w:p>
     <w:p>
@@ -3832,6 +4576,23 @@
           <w:i w:val="0"/>
         </w:rPr>
         <w:t>Case Brief clauses were accepted by the Judge but not by Fairness, so five correct rulings were blocked and accuracy fell from 74% to 63%. Lesson: when one agent learns a new source of truth, every checker downstream must learn it too — we now test the pair together.</w:t>
+      </w:r>
+    </w:p>
+    <w:p>
+      <w:pPr>
+        <w:pStyle w:val="Heading3"/>
+      </w:pPr>
+      <w:r>
+        <w:t>Failure 5 — A silent bug that flattered the score (2/10)</w:t>
+      </w:r>
+    </w:p>
+    <w:p>
+      <w:pPr/>
+      <w:r>
+        <w:rPr>
+          <w:i w:val="0"/>
+        </w:rPr>
+        <w:t>Rebuttals were capped at 300 tokens, and gpt-oss counts its hidden reasoning in that budget, so 17% of rebuttals came back empty and the debate carried a placeholder. Fixing it lowered the score from 30 to 29: on CR-001 the driver's missing rebuttal had been helping the Judge. Lesson: a silent failure can make results look better than the system is; check that every step actually produced output.</w:t>
       </w:r>
     </w:p>
     <w:p>
@@ -4380,6 +5141,68 @@
           </w:p>
         </w:tc>
       </w:tr>
+      <w:tr>
+        <w:tc>
+          <w:tcPr>
+            <w:tcW w:type="dxa" w:w="2256"/>
+          </w:tcPr>
+          <w:p>
+            <w:r>
+              <w:t>V6</w:t>
+            </w:r>
+            <w:r>
+              <w:rPr>
+                <w:sz w:val="19"/>
+              </w:rPr>
+            </w:r>
+          </w:p>
+        </w:tc>
+        <w:tc>
+          <w:tcPr>
+            <w:tcW w:type="dxa" w:w="2256"/>
+          </w:tcPr>
+          <w:p>
+            <w:r>
+              <w:t>2/10–5/10</w:t>
+            </w:r>
+            <w:r>
+              <w:rPr>
+                <w:sz w:val="19"/>
+              </w:rPr>
+            </w:r>
+          </w:p>
+        </w:tc>
+        <w:tc>
+          <w:tcPr>
+            <w:tcW w:type="dxa" w:w="2256"/>
+          </w:tcPr>
+          <w:p>
+            <w:r>
+              <w:t>+ labels from asks, payout guards, Judge principles, party notices, Supabase records, rider/driver history, provider fallback</w:t>
+            </w:r>
+            <w:r>
+              <w:rPr>
+                <w:sz w:val="19"/>
+              </w:rPr>
+            </w:r>
+          </w:p>
+        </w:tc>
+        <w:tc>
+          <w:tcPr>
+            <w:tcW w:type="dxa" w:w="2256"/>
+          </w:tcPr>
+          <w:p>
+            <w:r>
+              <w:t>Wrong labels on multi-ask filings; wrong payouts executed automatically</w:t>
+            </w:r>
+            <w:r>
+              <w:rPr>
+                <w:sz w:val="19"/>
+              </w:rPr>
+            </w:r>
+          </w:p>
+        </w:tc>
+      </w:tr>
     </w:tbl>
     <w:p/>
     <w:p>
@@ -4785,7 +5608,7 @@
         <w:rPr>
           <w:i w:val="0"/>
         </w:rPr>
-        <w:t>Confirming run (1/10 evening, 27 cases: 14 dev + 13 held-out, Cerebras gpt-oss-120b, one run each, final code):</w:t>
+        <w:t>Latest full run (5/10, run 20261005-131434, 33 cases: 14 dev + 19 held-out, Cerebras gpt-oss-120b, full debates, final code):</w:t>
       </w:r>
     </w:p>
     <w:tbl>
@@ -4888,7 +5711,7 @@
           </w:tcPr>
           <w:p>
             <w:r>
-              <w:t>93% (25/27; dev 100%, held-out 85%)</w:t>
+              <w:t>94% (31/33; dev 13/14, held-out 18/19)</w:t>
             </w:r>
             <w:r>
               <w:rPr>
@@ -4933,7 +5756,7 @@
           </w:tcPr>
           <w:p>
             <w:r>
-              <w:t>91% (20/22)</w:t>
+              <w:t>93% (25/27)</w:t>
             </w:r>
             <w:r>
               <w:rPr>
@@ -4977,12 +5800,13 @@
             <w:tcW w:type="dxa" w:w="3009"/>
           </w:tcPr>
           <w:p>
-            <w:r/>
-            <w:r>
-              <w:rPr>
-                <w:sz w:val="19"/>
-              </w:rPr>
-              <w:t>100%</w:t>
+            <w:r>
+              <w:t>100% (28/28)</w:t>
+            </w:r>
+            <w:r>
+              <w:rPr>
+                <w:sz w:val="19"/>
+              </w:rPr>
             </w:r>
           </w:p>
         </w:tc>
@@ -5286,7 +6110,7 @@
           </w:tcPr>
           <w:p>
             <w:r>
-              <w:t>median 91 s (10 s compute; the rest is free-tier pacing)</w:t>
+              <w:t>median 91 s (12 s model time; the rest is free-tier pacing)</w:t>
             </w:r>
             <w:r>
               <w:rPr>
@@ -5331,7 +6155,7 @@
           </w:tcPr>
           <w:p>
             <w:r>
-              <w:t>about US$0.011 (~25k tokens)</w:t>
+              <w:t>about US$0.011 (~26k tokens)</w:t>
             </w:r>
             <w:r>
               <w:rPr>
@@ -5349,16 +6173,16 @@
         <w:rPr>
           <w:i w:val="0"/>
         </w:rPr>
-        <w:t>The earlier 1/10 run with the Case Brief scored 63% because of the integration gap in Iteration 9. Replaying its rulings through the fixes projected 25/27, and the confirming run scored exactly 25/27. The two misses (NS-002-B1 and NS-002-C1) are Judge reasoning errors on no-show fees; the deterministic fee-basis check sends both to a person instead of executing them. Paraphrase and injection checks all passed; one of three counterfactual checks failed (NS-002-C1). A stability run on 2/10 repeated the eight cases that had flipped between earlier runs three times each: 24/24 verdicts and refunds correct, consistency 1.0.</w:t>
-      </w:r>
-    </w:p>
-    <w:p>
-      <w:pPr/>
-      <w:r>
-        <w:rPr>
-          <w:i w:val="0"/>
-        </w:rPr>
-        <w:t>Six new held-out cases were then written that the code had never been tuned on (two-ask filings, a GPS gap on a metered fare, a capped damage claim, a valid cleaning fee, a "coming in 2 min" message, a promo already returned). Baseline: 3/6 verdicts correct. The five cases with a refund to score all got the right amount; the sixth should have gone to a person and was paid instead. Two misses are labels on two-ask filings (upheld instead of partially_upheld, one caused by our own label rule) and one is a fare dispute with a GPS gap that should have gone to a person; our GPS-gap check only covered no-show, cancellation and route disputes. The answer keys are being checked by a person before these are fixed.</w:t>
+        <w:t>Path to this result: the 1/10 confirming run scored 25/27; after the label fix and full debates the set grew to 33 cases and scored 29/33 (2/10), then 30/33 with the payout guards and Judge principles (4/10), then 31/33 in the regression run. Paraphrase 4/4 and injection 3/3 passed; counterfactual 2/3 (NS-002-C1, still sent to a person by the fee-basis check). Both remaining misses go to a person, so no wrong ruling is executed automatically. A stability run on 2/10 repeated the eight cases that had flipped between earlier runs three times each: 24/24 verdicts and refunds correct, consistency 1.0.</w:t>
+      </w:r>
+    </w:p>
+    <w:p>
+      <w:pPr/>
+      <w:r>
+        <w:rPr>
+          <w:i w:val="0"/>
+        </w:rPr>
+        <w:t>Six held-out cases written after the confirming run (two-ask filings, a GPS gap on a metered fare, a capped damage claim, a valid cleaning fee, a "coming in 2 min" message, a promo already returned) first scored 3/6; the general fixes of Iterations 10–11 (labels from asks, the metered-fare GPS gap) addressed them, and they are part of the 33-case result. Because these 33 cases have now shaped the prompts, the generalisation number will come from a sealed set run once before submission.</w:t>
       </w:r>
     </w:p>
     <w:p>
@@ -5455,6 +6279,18 @@
     </w:p>
     <w:p>
       <w:pPr>
+        <w:pStyle w:val="ListParagraph"/>
+      </w:pPr>
+      <w:r>
+        <w:rPr>
+          <w:b/>
+        </w:rPr>
+        <w:t>•  Make silent failures loud. Empty rebuttals had raised the score; a warning on every empty reply now catches it.</w:t>
+      </w:r>
+      <w:r/>
+    </w:p>
+    <w:p>
+      <w:pPr>
         <w:pStyle w:val="Heading2"/>
       </w:pPr>
       <w:r>
@@ -5466,7 +6302,7 @@
         <w:pStyle w:val="ListParagraph"/>
       </w:pPr>
       <w:r>
-        <w:t>•  A single-call baseline to show what the multi-agent design buys; fix the Judge’s no-show fee reasoning (NS-002-B1/C1) rather than only catching it; handle two-ask filings in the label rule and extend the GPS-gap check to metered fares.</w:t>
+        <w:t>•  A single-call baseline to show what the multi-agent design buys; fix the Judge's no-show fee reasoning on NS-002-C1 rather than only catching it; run the sealed set once before submission.</w:t>
       </w:r>
     </w:p>
     <w:p>
@@ -5499,6 +6335,14 @@
       </w:pPr>
       <w:r>
         <w:t>•  Image evidence (damage and cleaning claims) and more dispute types.</w:t>
+      </w:r>
+    </w:p>
+    <w:p>
+      <w:pPr>
+        <w:pStyle w:val="ListParagraph"/>
+      </w:pPr>
+      <w:r>
+        <w:t>•  Let the Policy agent query the Tencent ADP assistant, and build the fraud and bad-faith agent on the new history store (design in docs/09_FRAUD_AGENT_DESIGN.md).</w:t>
       </w:r>
     </w:p>
     <w:p>

</xml_diff>

<commit_message>
feat: full agent chain in the dashboard, human review desk with ADP assistant, escalation snapshots
</commit_message>
<xml_diff>
--- a/docs/Development_Journal.docx
+++ b/docs/Development_Journal.docx
@@ -16,7 +16,7 @@
         <w:rPr>
           <w:i/>
         </w:rPr>
-        <w:t>Multi-agent dispute resolution for the Ryde platform. Development report covering 18 September – 5 October 2026.</w:t>
+        <w:t xml:space="preserve">Multi-agent dispute resolution for the Ryde platform. Development report covering 18 September – 9 October 2026.</w:t>
       </w:r>
     </w:p>
     <w:p>
@@ -88,27 +88,24 @@
         <w:pStyle w:val="ListParagraph"/>
       </w:pPr>
       <w:r>
-        <w:rPr>
-          <w:b/>
-        </w:rPr>
-        <w:t>•  Development period: 18/9/2026 – 5/10/2026 (submission deadline 16/10/2026)</w:t>
+        <w:rPr/>
+        <w:t xml:space="preserve">•  Development period: 18/9/2026 – 9/10/2026 (submission deadline 16/10/2026)</w:t>
+      </w:r>
+    </w:p>
+    <w:p>
+      <w:pPr>
+        <w:pStyle w:val="ListParagraph"/>
+      </w:pPr>
+      <w:r>
+        <w:rPr>
+          <w:b/>
+        </w:rPr>
+        <w:t>•  Main technologies: Python 3.13, FastAPI, LangGraph, Pydantic; LLMs: Google Gemini 2.5 Flash (first week), Groq and Cerebras gpt-oss-120b (evaluation); Qdrant Cloud hybrid search (BAAI/bge-base-en-v1.5 dense + BM25, fastembed) with local ChromaDB for tests; SQLite locally and Supabase Postgres for rulings, traces, rider/driver history and the audit log; Pytest; CodeBuddy; Tencent ADP (policy Q&amp;A, auxiliary).</w:t>
       </w:r>
       <w:r/>
     </w:p>
     <w:p>
       <w:pPr>
-        <w:pStyle w:val="ListParagraph"/>
-      </w:pPr>
-      <w:r>
-        <w:rPr>
-          <w:b/>
-        </w:rPr>
-        <w:t>•  Main technologies: Python 3.13, FastAPI, LangGraph, Pydantic; LLMs: Google Gemini 2.5 Flash (first week), Groq and Cerebras gpt-oss-120b (evaluation); Qdrant Cloud hybrid search (BAAI/bge-base-en-v1.5 dense + BM25, fastembed) with local ChromaDB for tests; SQLite locally and Supabase Postgres for rulings, traces, rider/driver history and the audit log; Pytest; CodeBuddy; Tencent ADP (policy Q&amp;A, auxiliary).</w:t>
-      </w:r>
-      <w:r/>
-    </w:p>
-    <w:p>
-      <w:pPr>
         <w:pStyle w:val="Heading2"/>
       </w:pPr>
       <w:r>
@@ -1896,6 +1893,498 @@
         <w:rPr>
           <w:i w:val="0"/>
         </w:rPr>
+      </w:r>
+    </w:p>
+    <w:p>
+      <w:pPr>
+        <w:pStyle w:val="Heading3"/>
+      </w:pPr>
+      <w:r>
+        <w:t xml:space="preserve">Day 14 — Fraud &amp; Bad-Faith agent</w:t>
+      </w:r>
+    </w:p>
+    <w:p>
+      <w:pPr/>
+      <w:r>
+        <w:rPr>
+          <w:b/>
+        </w:rPr>
+        <w:t xml:space="preserve">Date: 6/10/2026</w:t>
+      </w:r>
+    </w:p>
+    <w:p>
+      <w:pPr/>
+      <w:r>
+        <w:rPr>
+          <w:b/>
+        </w:rPr>
+        <w:t xml:space="preserve">Objective: Detect claims made in bad faith (a stretch goal of the challenge) without letting a person's record decide a case its own data decides.</w:t>
+      </w:r>
+    </w:p>
+    <w:p>
+      <w:pPr/>
+      <w:r>
+        <w:rPr>
+          <w:b/>
+          <w:i w:val="0"/>
+        </w:rPr>
+        <w:t xml:space="preserve">Work completed:</w:t>
+      </w:r>
+    </w:p>
+    <w:p>
+      <w:pPr>
+        <w:pStyle w:val="ListParagraph"/>
+      </w:pPr>
+      <w:r>
+        <w:t xml:space="preserve">•  (billy) Fraud &amp; Bad-Faith agent after the Case Brief: code scores every signal (filer and counterparty history, claim-evidence timing, pair history); one LLM call only labels the chat into a fixed set. Its report reaches the Judge and Fairness, never the advocates; hard evidence sends the case to a person (D20).</w:t>
+      </w:r>
+    </w:p>
+    <w:p>
+      <w:pPr>
+        <w:pStyle w:val="ListParagraph"/>
+      </w:pPr>
+      <w:r>
+        <w:t xml:space="preserve">•  (billy) Fraud test cases CR-004, DR-003, FD-004, NS-005, and NS-006, the driver-side mirror of FD-004: a record must not decide a case its own data decides.</w:t>
+      </w:r>
+    </w:p>
+    <w:p>
+      <w:pPr>
+        <w:pStyle w:val="ListParagraph"/>
+      </w:pPr>
+      <w:r>
+        <w:t xml:space="preserve">•  (billy) The chat labeller must now quote the claim words a message contradicts; text addressed to an AI is "none" (D21).</w:t>
+      </w:r>
+    </w:p>
+    <w:p>
+      <w:pPr>
+        <w:pStyle w:val="ListParagraph"/>
+      </w:pPr>
+      <w:r>
+        <w:t xml:space="preserve">•  (billy) Threats became safety alerts instead of fraud signals; a "same claim again and again" signal measured the same way for riders and drivers (D22).</w:t>
+      </w:r>
+    </w:p>
+    <w:p>
+      <w:pPr/>
+      <w:r>
+        <w:rPr>
+          <w:b/>
+          <w:i w:val="0"/>
+        </w:rPr>
+        <w:t xml:space="preserve">Problems encountered:</w:t>
+      </w:r>
+    </w:p>
+    <w:p>
+      <w:pPr>
+        <w:pStyle w:val="ListParagraph"/>
+      </w:pPr>
+      <w:r>
+        <w:t xml:space="preserve">•  The labeller tagged a genuine rider's "I'm at the taxi stand now, where are you?" as a contradiction and raised the risk to MEDIUM.</w:t>
+      </w:r>
+    </w:p>
+    <w:p>
+      <w:pPr>
+        <w:pStyle w:val="ListParagraph"/>
+      </w:pPr>
+      <w:r>
+        <w:t xml:space="preserve">•  A threat counted as a fraud signal, so the report read as suspicion of the victim.</w:t>
+      </w:r>
+    </w:p>
+    <w:p>
+      <w:pPr>
+        <w:pStyle w:val="ListParagraph"/>
+      </w:pPr>
+      <w:r>
+        <w:t xml:space="preserve">•  Our first collusion case relied on a Ryde rule that is not published (whether the driver's share of a waived fee is taken back).</w:t>
+      </w:r>
+    </w:p>
+    <w:p>
+      <w:pPr/>
+      <w:r>
+        <w:rPr>
+          <w:b/>
+          <w:i w:val="0"/>
+        </w:rPr>
+        <w:t xml:space="preserve">What we did about it:</w:t>
+      </w:r>
+    </w:p>
+    <w:p>
+      <w:pPr>
+        <w:pStyle w:val="ListParagraph"/>
+      </w:pPr>
+      <w:r>
+        <w:t xml:space="preserve">•  Code checks the quoted claim words verbatim; threats go to Fairness as safety alerts with no flag on anyone; CR-004 rewritten as serial waiver claims.</w:t>
+      </w:r>
+    </w:p>
+    <w:p>
+      <w:pPr/>
+      <w:r>
+        <w:rPr>
+          <w:b/>
+        </w:rPr>
+        <w:t xml:space="preserve">Result: 35/37 (94.6%) on 37 cases, all fraud cases correct, refund 27/29, US$0.42 for the run (D20); 6/6 on the D22 cases.</w:t>
+      </w:r>
+    </w:p>
+    <w:p>
+      <w:pPr>
+        <w:pStyle w:val="Heading3"/>
+      </w:pPr>
+      <w:r>
+        <w:t xml:space="preserve">Day 15 — Autonomous evidence gathering</w:t>
+      </w:r>
+    </w:p>
+    <w:p>
+      <w:pPr/>
+      <w:r>
+        <w:rPr>
+          <w:b/>
+        </w:rPr>
+        <w:t xml:space="preserve">Date: 7/10/2026</w:t>
+      </w:r>
+    </w:p>
+    <w:p>
+      <w:pPr/>
+      <w:r>
+        <w:rPr>
+          <w:b/>
+        </w:rPr>
+        <w:t xml:space="preserve">Objective: Let the advocates gather evidence themselves, as the challenge asks, and try adaptive orchestration on an experimental branch with a rollback rule.</w:t>
+      </w:r>
+    </w:p>
+    <w:p>
+      <w:pPr/>
+      <w:r>
+        <w:rPr>
+          <w:b/>
+          <w:i w:val="0"/>
+        </w:rPr>
+        <w:t xml:space="preserve">Work completed:</w:t>
+      </w:r>
+    </w:p>
+    <w:p>
+      <w:pPr>
+        <w:pStyle w:val="ListParagraph"/>
+      </w:pPr>
+      <w:r>
+        <w:t xml:space="preserve">•  (billy) Rule-based auto-query into a shared evidence pool: 34/37 plus one run lost to the token cap. An audit showed it was autonomous in name only: 63% of items were bare counts, the planner ignored which side asked, and nothing was de-duplicated (D23 step 1).</w:t>
+      </w:r>
+    </w:p>
+    <w:p>
+      <w:pPr>
+        <w:pStyle w:val="ListParagraph"/>
+      </w:pPr>
+      <w:r>
+        <w:t xml:space="preserve">•  (billy) Numbered fact, policy and debate pools; before each turn the advocate chooses up to two lookups and two policy topics; arguments cite ids (D23 step 2).</w:t>
+      </w:r>
+    </w:p>
+    <w:p>
+      <w:pPr>
+        <w:pStyle w:val="ListParagraph"/>
+      </w:pPr>
+      <w:r>
+        <w:t xml:space="preserve">•  (billy) Experimental branch, each step kept only if a full run loses at most one verdict and P0 recall stays 1.0: token diet, triage (complexity × risk), typed debate moves (claim, challenge, concede), and a tiered Safety agent (D24).</w:t>
+      </w:r>
+    </w:p>
+    <w:p>
+      <w:pPr>
+        <w:pStyle w:val="ListParagraph"/>
+      </w:pPr>
+      <w:r>
+        <w:t xml:space="preserve">•  (Zhilin-sp) Demo reliability: access control, readiness checks, evidence uploads, Docker set-up and a one-click start script (PR #23).</w:t>
+      </w:r>
+    </w:p>
+    <w:p>
+      <w:pPr/>
+      <w:r>
+        <w:rPr>
+          <w:b/>
+          <w:i w:val="0"/>
+        </w:rPr>
+        <w:t xml:space="preserve">Problems encountered:</w:t>
+      </w:r>
+    </w:p>
+    <w:p>
+      <w:pPr>
+        <w:pStyle w:val="ListParagraph"/>
+      </w:pPr>
+      <w:r>
+        <w:t xml:space="preserve">•  Prompt tokens rose 55–67%.</w:t>
+      </w:r>
+    </w:p>
+    <w:p>
+      <w:pPr>
+        <w:pStyle w:val="ListParagraph"/>
+      </w:pPr>
+      <w:r>
+        <w:t xml:space="preserve">•  Workflow unit tests built the graph without a Safety stub and spent real LLM quota.</w:t>
+      </w:r>
+    </w:p>
+    <w:p>
+      <w:pPr>
+        <w:pStyle w:val="ListParagraph"/>
+      </w:pPr>
+      <w:r>
+        <w:t xml:space="preserve">•  A stopped eval left its Python process running, so the next resume ran a second copy on the same keys.</w:t>
+      </w:r>
+    </w:p>
+    <w:p>
+      <w:pPr/>
+      <w:r>
+        <w:rPr>
+          <w:b/>
+          <w:i w:val="0"/>
+        </w:rPr>
+        <w:t xml:space="preserve">What we did about it:</w:t>
+      </w:r>
+    </w:p>
+    <w:p>
+      <w:pPr>
+        <w:pStyle w:val="ListParagraph"/>
+      </w:pPr>
+      <w:r>
+        <w:t xml:space="preserve">•  Every LLM agent is stubbed in unit tests; eval clears the provider fallback chain; one eval process at a time; every run folder records its commit (VERSION.txt).</w:t>
+      </w:r>
+    </w:p>
+    <w:p>
+      <w:pPr/>
+      <w:r>
+        <w:rPr>
+          <w:b/>
+        </w:rPr>
+        <w:t xml:space="preserve">Result: The Safety-agent step scored 21/21 on the cases it covered, at +67% tokens.</w:t>
+      </w:r>
+    </w:p>
+    <w:p>
+      <w:pPr>
+        <w:pStyle w:val="Heading3"/>
+      </w:pPr>
+      <w:r>
+        <w:t xml:space="preserve">Day 16 — Judge checks and stress cases</w:t>
+      </w:r>
+    </w:p>
+    <w:p>
+      <w:pPr/>
+      <w:r>
+        <w:rPr>
+          <w:b/>
+        </w:rPr>
+        <w:t xml:space="preserve">Date: 8/10/2026</w:t>
+      </w:r>
+    </w:p>
+    <w:p>
+      <w:pPr/>
+      <w:r>
+        <w:rPr>
+          <w:b/>
+        </w:rPr>
+        <w:t xml:space="preserve">Objective: Make the new machinery pay for itself on hard cases.</w:t>
+      </w:r>
+    </w:p>
+    <w:p>
+      <w:pPr/>
+      <w:r>
+        <w:rPr>
+          <w:b/>
+          <w:i w:val="0"/>
+        </w:rPr>
+        <w:t xml:space="preserve">Work completed:</w:t>
+      </w:r>
+    </w:p>
+    <w:p>
+      <w:pPr>
+        <w:pStyle w:val="ListParagraph"/>
+      </w:pPr>
+      <w:r>
+        <w:t xml:space="preserve">•  (billy) A second round only when something new was found; advocates concede facts, never the outcome; repeated lookups not stored again (FD-002: −23% tokens).</w:t>
+      </w:r>
+    </w:p>
+    <w:p>
+      <w:pPr>
+        <w:pStyle w:val="ListParagraph"/>
+      </w:pPr>
+      <w:r>
+        <w:t xml:space="preserve">•  (billy) The Judge's money finding is kept apart from conduct, it rules on every contested issue, and a route_timing fact shows whether a detour came before the closure alert (D25); who a rule binds, and short GPS gaps as notes (D25b).</w:t>
+      </w:r>
+    </w:p>
+    <w:p>
+      <w:pPr>
+        <w:pStyle w:val="ListParagraph"/>
+      </w:pPr>
+      <w:r>
+        <w:t xml:space="preserve">•  (billy) Two hand-written stress cases (ST-001, ST-002); an LLM complexity hint (D26); an inconsistent ruling goes back to the Judge once (D27); before/after comparison (D28); a structured Judge whose causes list sets the refund in code (D29).</w:t>
+      </w:r>
+    </w:p>
+    <w:p>
+      <w:pPr/>
+      <w:r>
+        <w:rPr>
+          <w:b/>
+          <w:i w:val="0"/>
+        </w:rPr>
+        <w:t xml:space="preserve">Problems encountered:</w:t>
+      </w:r>
+    </w:p>
+    <w:p>
+      <w:pPr>
+        <w:pStyle w:val="ListParagraph"/>
+      </w:pPr>
+      <w:r>
+        <w:t xml:space="preserve">•  On the stress cases the model misread the same two facts under every format we tried (the order of detour and alert; whose stop it was).</w:t>
+      </w:r>
+    </w:p>
+    <w:p>
+      <w:pPr>
+        <w:pStyle w:val="ListParagraph"/>
+      </w:pPr>
+      <w:r>
+        <w:t xml:space="preserve">•  Raising the complexity grade cost 2.6× tokens and changed nothing.</w:t>
+      </w:r>
+    </w:p>
+    <w:p>
+      <w:pPr/>
+      <w:r>
+        <w:rPr>
+          <w:b/>
+          <w:i w:val="0"/>
+        </w:rPr>
+        <w:t xml:space="preserve">What we did about it:</w:t>
+      </w:r>
+    </w:p>
+    <w:p>
+      <w:pPr>
+        <w:pStyle w:val="ListParagraph"/>
+      </w:pPr>
+      <w:r>
+        <w:t xml:space="preserve">•  Stress cases kept as "must reach a person" and not tuned further (overfitting rule); remands make a wrong ruling reach a person instead of executing.</w:t>
+      </w:r>
+    </w:p>
+    <w:p>
+      <w:pPr/>
+      <w:r>
+        <w:rPr>
+          <w:b/>
+        </w:rPr>
+        <w:t xml:space="preserve">Result: The D22 code executed a wrong S$17.50 refund on ST-002; the new version sent the same case to a person.</w:t>
+      </w:r>
+    </w:p>
+    <w:p>
+      <w:pPr>
+        <w:pStyle w:val="Heading3"/>
+      </w:pPr>
+      <w:r>
+        <w:t xml:space="preserve">Day 17 — Full regressions and the architecture decision</w:t>
+      </w:r>
+    </w:p>
+    <w:p>
+      <w:pPr/>
+      <w:r>
+        <w:rPr>
+          <w:b/>
+        </w:rPr>
+        <w:t xml:space="preserve">Date: 9/10/2026</w:t>
+      </w:r>
+    </w:p>
+    <w:p>
+      <w:pPr/>
+      <w:r>
+        <w:rPr>
+          <w:b/>
+        </w:rPr>
+        <w:t xml:space="preserve">Objective: Decide with full runs, not single cases, which architecture to submit.</w:t>
+      </w:r>
+    </w:p>
+    <w:p>
+      <w:pPr/>
+      <w:r>
+        <w:rPr>
+          <w:b/>
+          <w:i w:val="0"/>
+        </w:rPr>
+        <w:t xml:space="preserve">Work completed:</w:t>
+      </w:r>
+    </w:p>
+    <w:p>
+      <w:pPr>
+        <w:pStyle w:val="ListParagraph"/>
+      </w:pPr>
+      <w:r>
+        <w:t xml:space="preserve">•  (billy) Full regressions of both new branches and a second run of the structured Judge (D30, D31).</w:t>
+      </w:r>
+    </w:p>
+    <w:p>
+      <w:pPr>
+        <w:pStyle w:val="ListParagraph"/>
+      </w:pPr>
+      <w:r>
+        <w:t xml:space="preserve">•  (billy, with CodeBuddy) Decision: keep the D22 pipeline and port only triage, the tiered Safety agent, the Fairness audit switch and a debate round cap to a new branch off main (feature/adaptive-triage); 436 unit tests pass.</w:t>
+      </w:r>
+    </w:p>
+    <w:p>
+      <w:pPr>
+        <w:pStyle w:val="ListParagraph"/>
+      </w:pPr>
+      <w:r>
+        <w:t xml:space="preserve">•  (billy) Checked on recorded runs before spending tokens: on simple, safe cases the Fairness LLM audit never changed an outcome; both cases with a chat threat are labelled "rule on the money, do not escalate", which the new Safety tiers do.</w:t>
+      </w:r>
+    </w:p>
+    <w:p>
+      <w:pPr/>
+      <w:r>
+        <w:rPr>
+          <w:b/>
+          <w:i w:val="0"/>
+        </w:rPr>
+        <w:t xml:space="preserve">Problems encountered:</w:t>
+      </w:r>
+    </w:p>
+    <w:p>
+      <w:pPr>
+        <w:pStyle w:val="ListParagraph"/>
+      </w:pPr>
+      <w:r>
+        <w:t xml:space="preserve">•  32/37, 32/37 and 31/37 against D20's 35/37, at 42–47% more tokens.</w:t>
+      </w:r>
+    </w:p>
+    <w:p>
+      <w:pPr>
+        <w:pStyle w:val="ListParagraph"/>
+      </w:pPr>
+      <w:r>
+        <w:t xml:space="preserve">•  The NEW_POINT early stop rarely fires: 7 of 8 complex cases ran a second round.</w:t>
+      </w:r>
+    </w:p>
+    <w:p>
+      <w:pPr>
+        <w:pStyle w:val="ListParagraph"/>
+      </w:pPr>
+      <w:r>
+        <w:t xml:space="preserve">•  The daily token cap stopped the first pass after 15 cases.</w:t>
+      </w:r>
+    </w:p>
+    <w:p>
+      <w:pPr/>
+      <w:r>
+        <w:rPr>
+          <w:b/>
+          <w:i w:val="0"/>
+        </w:rPr>
+        <w:t xml:space="preserve">What we did about it:</w:t>
+      </w:r>
+    </w:p>
+    <w:p>
+      <w:pPr>
+        <w:pStyle w:val="ListParagraph"/>
+      </w:pPr>
+      <w:r>
+        <w:t xml:space="preserve">•  Keys rotated with --resume; quota-failed traces moved aside so no case counts twice.</w:t>
+      </w:r>
+    </w:p>
+    <w:p>
+      <w:pPr/>
+      <w:r>
+        <w:rPr>
+          <w:b/>
+        </w:rPr>
+        <w:t xml:space="preserve">Result: 35/38 (92.1%), every miss sent to a person; on the 37 cases shared with D20, 34/37 against 35/37 at +6% tokens (run 20261009-164028).</w:t>
       </w:r>
     </w:p>
     <w:p>
@@ -3066,6 +3555,366 @@
           </w:p>
         </w:tc>
       </w:tr>
+      <w:tr>
+        <w:tc>
+          <w:tcPr>
+            <w:tcW w:type="dxa" w:w="1289"/>
+          </w:tcPr>
+          <w:p>
+            <w:r>
+              <w:t xml:space="preserve">13. Fraud agent</w:t>
+            </w:r>
+          </w:p>
+        </w:tc>
+        <w:tc>
+          <w:tcPr>
+            <w:tcW w:type="dxa" w:w="1289"/>
+          </w:tcPr>
+          <w:p>
+            <w:r>
+              <w:t xml:space="preserve">6/10</w:t>
+            </w:r>
+          </w:p>
+        </w:tc>
+        <w:tc>
+          <w:tcPr>
+            <w:tcW w:type="dxa" w:w="1289"/>
+          </w:tcPr>
+          <w:p>
+            <w:r>
+              <w:t xml:space="preserve">Fraud &amp; Bad-Faith agent, threats as safety alerts</w:t>
+            </w:r>
+          </w:p>
+        </w:tc>
+        <w:tc>
+          <w:tcPr>
+            <w:tcW w:type="dxa" w:w="1289"/>
+          </w:tcPr>
+          <w:p>
+            <w:r>
+              <w:t xml:space="preserve">37</w:t>
+            </w:r>
+          </w:p>
+        </w:tc>
+        <w:tc>
+          <w:tcPr>
+            <w:tcW w:type="dxa" w:w="1289"/>
+          </w:tcPr>
+          <w:p>
+            <w:r>
+              <w:t xml:space="preserve">95% (35/37)</w:t>
+            </w:r>
+          </w:p>
+        </w:tc>
+        <w:tc>
+          <w:tcPr>
+            <w:tcW w:type="dxa" w:w="1289"/>
+          </w:tcPr>
+          <w:p>
+            <w:r>
+              <w:t xml:space="preserve">93% (27/29)</w:t>
+            </w:r>
+          </w:p>
+        </w:tc>
+        <w:tc>
+          <w:tcPr>
+            <w:tcW w:type="dxa" w:w="1289"/>
+          </w:tcPr>
+          <w:p>
+            <w:r>
+              <w:t xml:space="preserve">All fraud cases correct; ~26.6k tokens per case</w:t>
+            </w:r>
+          </w:p>
+        </w:tc>
+      </w:tr>
+      <w:tr>
+        <w:tc>
+          <w:tcPr>
+            <w:tcW w:type="dxa" w:w="1289"/>
+          </w:tcPr>
+          <w:p>
+            <w:r>
+              <w:t xml:space="preserve">14. Evidence pools</w:t>
+            </w:r>
+          </w:p>
+        </w:tc>
+        <w:tc>
+          <w:tcPr>
+            <w:tcW w:type="dxa" w:w="1289"/>
+          </w:tcPr>
+          <w:p>
+            <w:r>
+              <w:t xml:space="preserve">7/10</w:t>
+            </w:r>
+          </w:p>
+        </w:tc>
+        <w:tc>
+          <w:tcPr>
+            <w:tcW w:type="dxa" w:w="1289"/>
+          </w:tcPr>
+          <w:p>
+            <w:r>
+              <w:t xml:space="preserve">Advocates choose lookups; numbered pools; Safety agent</w:t>
+            </w:r>
+          </w:p>
+        </w:tc>
+        <w:tc>
+          <w:tcPr>
+            <w:tcW w:type="dxa" w:w="1289"/>
+          </w:tcPr>
+          <w:p>
+            <w:r>
+              <w:t xml:space="preserve">37 (part)</w:t>
+            </w:r>
+          </w:p>
+        </w:tc>
+        <w:tc>
+          <w:tcPr>
+            <w:tcW w:type="dxa" w:w="1289"/>
+          </w:tcPr>
+          <w:p>
+            <w:r>
+              <w:t xml:space="preserve">34/37; 21/21 (part)</w:t>
+            </w:r>
+          </w:p>
+        </w:tc>
+        <w:tc>
+          <w:tcPr>
+            <w:tcW w:type="dxa" w:w="1289"/>
+          </w:tcPr>
+          <w:p>
+            <w:r>
+              <w:t xml:space="preserve">—</w:t>
+            </w:r>
+          </w:p>
+        </w:tc>
+        <w:tc>
+          <w:tcPr>
+            <w:tcW w:type="dxa" w:w="1289"/>
+          </w:tcPr>
+          <w:p>
+            <w:r>
+              <w:t xml:space="preserve">+55–67% tokens</w:t>
+            </w:r>
+          </w:p>
+        </w:tc>
+      </w:tr>
+      <w:tr>
+        <w:tc>
+          <w:tcPr>
+            <w:tcW w:type="dxa" w:w="1289"/>
+          </w:tcPr>
+          <w:p>
+            <w:r>
+              <w:t xml:space="preserve">15. Judge checks</w:t>
+            </w:r>
+          </w:p>
+        </w:tc>
+        <w:tc>
+          <w:tcPr>
+            <w:tcW w:type="dxa" w:w="1289"/>
+          </w:tcPr>
+          <w:p>
+            <w:r>
+              <w:t xml:space="preserve">8/10</w:t>
+            </w:r>
+          </w:p>
+        </w:tc>
+        <w:tc>
+          <w:tcPr>
+            <w:tcW w:type="dxa" w:w="1289"/>
+          </w:tcPr>
+          <w:p>
+            <w:r>
+              <w:t xml:space="preserve">Money vs conduct, issue rulings, remand, structured causes</w:t>
+            </w:r>
+          </w:p>
+        </w:tc>
+        <w:tc>
+          <w:tcPr>
+            <w:tcW w:type="dxa" w:w="1289"/>
+          </w:tcPr>
+          <w:p>
+            <w:r>
+              <w:t xml:space="preserve">stress + subsets</w:t>
+            </w:r>
+          </w:p>
+        </w:tc>
+        <w:tc>
+          <w:tcPr>
+            <w:tcW w:type="dxa" w:w="1289"/>
+          </w:tcPr>
+          <w:p>
+            <w:r>
+              <w:t xml:space="preserve">—</w:t>
+            </w:r>
+          </w:p>
+        </w:tc>
+        <w:tc>
+          <w:tcPr>
+            <w:tcW w:type="dxa" w:w="1289"/>
+          </w:tcPr>
+          <w:p>
+            <w:r>
+              <w:t xml:space="preserve">—</w:t>
+            </w:r>
+          </w:p>
+        </w:tc>
+        <w:tc>
+          <w:tcPr>
+            <w:tcW w:type="dxa" w:w="1289"/>
+          </w:tcPr>
+          <w:p>
+            <w:r>
+              <w:t xml:space="preserve">Wrong ST-002 refund now reaches a person</w:t>
+            </w:r>
+          </w:p>
+        </w:tc>
+      </w:tr>
+      <w:tr>
+        <w:tc>
+          <w:tcPr>
+            <w:tcW w:type="dxa" w:w="1289"/>
+          </w:tcPr>
+          <w:p>
+            <w:r>
+              <w:t xml:space="preserve">16. Full regressions</w:t>
+            </w:r>
+          </w:p>
+        </w:tc>
+        <w:tc>
+          <w:tcPr>
+            <w:tcW w:type="dxa" w:w="1289"/>
+          </w:tcPr>
+          <w:p>
+            <w:r>
+              <w:t xml:space="preserve">9/10</w:t>
+            </w:r>
+          </w:p>
+        </w:tc>
+        <w:tc>
+          <w:tcPr>
+            <w:tcW w:type="dxa" w:w="1289"/>
+          </w:tcPr>
+          <w:p>
+            <w:r>
+              <w:t xml:space="preserve">Both new branches, full set</w:t>
+            </w:r>
+          </w:p>
+        </w:tc>
+        <w:tc>
+          <w:tcPr>
+            <w:tcW w:type="dxa" w:w="1289"/>
+          </w:tcPr>
+          <w:p>
+            <w:r>
+              <w:t xml:space="preserve">37</w:t>
+            </w:r>
+          </w:p>
+        </w:tc>
+        <w:tc>
+          <w:tcPr>
+            <w:tcW w:type="dxa" w:w="1289"/>
+          </w:tcPr>
+          <w:p>
+            <w:r>
+              <w:t xml:space="preserve">86% (32/37, 32/37, 31/37)</w:t>
+            </w:r>
+          </w:p>
+        </w:tc>
+        <w:tc>
+          <w:tcPr>
+            <w:tcW w:type="dxa" w:w="1289"/>
+          </w:tcPr>
+          <w:p>
+            <w:r>
+              <w:t xml:space="preserve">80% (24/30)</w:t>
+            </w:r>
+          </w:p>
+        </w:tc>
+        <w:tc>
+          <w:tcPr>
+            <w:tcW w:type="dxa" w:w="1289"/>
+          </w:tcPr>
+          <w:p>
+            <w:r>
+              <w:t xml:space="preserve">+42–47% tokens; not adopted</w:t>
+            </w:r>
+          </w:p>
+        </w:tc>
+      </w:tr>
+      <w:tr>
+        <w:tc>
+          <w:tcPr>
+            <w:tcW w:type="dxa" w:w="1289"/>
+          </w:tcPr>
+          <w:p>
+            <w:r>
+              <w:t xml:space="preserve">17. Adaptive triage</w:t>
+            </w:r>
+          </w:p>
+        </w:tc>
+        <w:tc>
+          <w:tcPr>
+            <w:tcW w:type="dxa" w:w="1289"/>
+          </w:tcPr>
+          <w:p>
+            <w:r>
+              <w:t xml:space="preserve">9/10</w:t>
+            </w:r>
+          </w:p>
+        </w:tc>
+        <w:tc>
+          <w:tcPr>
+            <w:tcW w:type="dxa" w:w="1289"/>
+          </w:tcPr>
+          <w:p>
+            <w:r>
+              <w:t xml:space="preserve">Triage + Safety tiers on the D22 code</w:t>
+            </w:r>
+          </w:p>
+        </w:tc>
+        <w:tc>
+          <w:tcPr>
+            <w:tcW w:type="dxa" w:w="1289"/>
+          </w:tcPr>
+          <w:p>
+            <w:r>
+              <w:t xml:space="preserve">38</w:t>
+            </w:r>
+          </w:p>
+        </w:tc>
+        <w:tc>
+          <w:tcPr>
+            <w:tcW w:type="dxa" w:w="1289"/>
+          </w:tcPr>
+          <w:p>
+            <w:r>
+              <w:t xml:space="preserve">92% (35/38)</w:t>
+            </w:r>
+          </w:p>
+        </w:tc>
+        <w:tc>
+          <w:tcPr>
+            <w:tcW w:type="dxa" w:w="1289"/>
+          </w:tcPr>
+          <w:p>
+            <w:r>
+              <w:t xml:space="preserve">90% (28/31)</w:t>
+            </w:r>
+          </w:p>
+        </w:tc>
+        <w:tc>
+          <w:tcPr>
+            <w:tcW w:type="dxa" w:w="1289"/>
+          </w:tcPr>
+          <w:p>
+            <w:r>
+              <w:t xml:space="preserve">34/37 on D20 cases; +6% tokens</w:t>
+            </w:r>
+          </w:p>
+        </w:tc>
+      </w:tr>
     </w:tbl>
     <w:p/>
     <w:p>
@@ -3377,6 +4226,91 @@
     </w:p>
     <w:p>
       <w:pPr>
+        <w:pStyle w:val="Heading3"/>
+      </w:pPr>
+      <w:r>
+        <w:t xml:space="preserve">Iteration 13 — Fraud and bad faith (6/10)</w:t>
+      </w:r>
+    </w:p>
+    <w:p>
+      <w:pPr/>
+      <w:r>
+        <w:rPr>
+          <w:i w:val="0"/>
+        </w:rPr>
+        <w:t xml:space="preserve">The Fraud agent's report reaches the Judge and Fairness only, and only code decides what counts as a signal. Run D20: 35/37 (94.6%), refund 27/29, all four fraud cases correct; the two misses (NS-002-B1, NS-002-C1) failed the same way before the agent existed and went to a person. Two follow-ups came from reading the traces, not from the score: a contradiction label must quote the claim it contradicts (D21), and a threat is a safety matter, not evidence of fraud (D22).</w:t>
+      </w:r>
+    </w:p>
+    <w:p>
+      <w:pPr>
+        <w:pStyle w:val="Heading3"/>
+      </w:pPr>
+      <w:r>
+        <w:t xml:space="preserve">Iteration 14 — Autonomous evidence gathering (7/10)</w:t>
+      </w:r>
+    </w:p>
+    <w:p>
+      <w:pPr/>
+      <w:r>
+        <w:rPr>
+          <w:i w:val="0"/>
+        </w:rPr>
+        <w:t xml:space="preserve">The rule-based auto-query scored 34/37 but chose nothing itself. Numbered pools with an LLM research step per turn did give the advocates real choices (on RD-001-P4 a passenger lookup answered the clause the Judge had misapplied), but prompt tokens rose by 55–67%. Each step of the adaptive branch had to pass a rollback rule: at most one verdict lost, P0 recall 1.0, escalation accuracy at least 0.94.</w:t>
+      </w:r>
+    </w:p>
+    <w:p>
+      <w:pPr>
+        <w:pStyle w:val="Heading3"/>
+      </w:pPr>
+      <w:r>
+        <w:t xml:space="preserve">Iteration 15 — Judge checks and stress cases (8/10)</w:t>
+      </w:r>
+    </w:p>
+    <w:p>
+      <w:pPr/>
+      <w:r>
+        <w:rPr>
+          <w:i w:val="0"/>
+        </w:rPr>
+        <w:t xml:space="preserve">Two hand-written stress cases showed where the Judge fails: it misread the order of a detour and a closure alert and whose stop added the distance, under every output format we tried. The new checks did not make it right, but they changed what happens to a wrong ruling: the D22 code executed a wrong S$17.50 refund on ST-002 with Fairness's approval, while the new version sent it back to the Judge once and then to a person.</w:t>
+      </w:r>
+    </w:p>
+    <w:p>
+      <w:pPr>
+        <w:pStyle w:val="Heading3"/>
+      </w:pPr>
+      <w:r>
+        <w:t xml:space="preserve">Iteration 16 — Full regressions (9/10)</w:t>
+      </w:r>
+    </w:p>
+    <w:p>
+      <w:pPr/>
+      <w:r>
+        <w:rPr>
+          <w:i w:val="0"/>
+        </w:rPr>
+        <w:t xml:space="preserve">Three full runs of the new architecture scored 32/37, 32/37 and 31/37 against D20's 35/37, each at 42–47% more tokens, so every variant failed the rollback rule. Several misses were caused by the new machinery itself (a correct dismissal sent to a person after the Judge dropped its causes list on remand). Single runs move by about two cases, but three runs below the baseline is a consistent signal.</w:t>
+      </w:r>
+    </w:p>
+    <w:p>
+      <w:pPr>
+        <w:pStyle w:val="Heading3"/>
+      </w:pPr>
+      <w:r>
+        <w:t xml:space="preserve">Iteration 17 — Adaptive triage on the proven pipeline (9/10)</w:t>
+      </w:r>
+    </w:p>
+    <w:p>
+      <w:pPr/>
+      <w:r>
+        <w:rPr>
+          <w:i w:val="0"/>
+        </w:rPr>
+        <w:t xml:space="preserve">We kept the D22 pipeline and moved over only what had a measured or safety reason: code-only triage (simple cases one round and code-only Fairness checks; complex cases up to two rounds), the tiered Safety agent, and a NEW_POINT tag so a second round runs only when a side raises something new. Before spending tokens we replayed the decision on recorded runs: the Fairness LLM audit never changed an outcome on a simple, safe case, and the evaluation labels for chat threats ask for a ruling, as the Safety tiers now give. Full run 20261009-164028: 35/38 (92.1%). On the 37 cases shared with D20 it scored 34/37 against 35/37, at 6% more tokens (1.04M vs 0.98M) and a shorter median time (92 s vs 103 s). The one new miss (CR-001) was a Judge error that Fairness's code check sent to a person; D20 had ruled it correctly. 16 of 18 complex cases ran a second round, so the NEW_POINT early stop rarely saves anything.</w:t>
+      </w:r>
+    </w:p>
+    <w:p>
+      <w:pPr>
         <w:pStyle w:val="Heading2"/>
       </w:pPr>
       <w:r>
@@ -3399,126 +4333,134 @@
           <w:rFonts w:ascii="Consolas" w:hAnsi="Consolas" w:eastAsia="Consolas"/>
           <w:sz w:val="18"/>
         </w:rPr>
-        <w:t>START</w:t>
-        <w:br/>
+        <w:t xml:space="preserve">START</w:t>
       </w:r>
       <w:r>
         <w:rPr>
           <w:rFonts w:ascii="Consolas" w:hAnsi="Consolas" w:eastAsia="Consolas"/>
           <w:sz w:val="18"/>
         </w:rPr>
+        <w:br/>
         <w:t xml:space="preserve"> -&gt; Collector      load trip, payment, chat, GPS, app events, the trip's rules;</w:t>
-        <w:br/>
       </w:r>
       <w:r>
         <w:rPr>
           <w:rFonts w:ascii="Consolas" w:hAnsi="Consolas" w:eastAsia="Consolas"/>
           <w:sz w:val="18"/>
         </w:rPr>
+        <w:br/>
         <w:t xml:space="preserve">                   run 9 deterministic tools -&gt; facts / conflicts / gaps with sources</w:t>
-        <w:br/>
       </w:r>
       <w:r>
         <w:rPr>
           <w:rFonts w:ascii="Consolas" w:hAnsi="Consolas" w:eastAsia="Consolas"/>
           <w:sz w:val="18"/>
         </w:rPr>
+        <w:br/>
         <w:t xml:space="preserve"> -&gt; Classifier     P0 safety keywords first, then type and urgency</w:t>
-        <w:br/>
       </w:r>
       <w:r>
         <w:rPr>
           <w:rFonts w:ascii="Consolas" w:hAnsi="Consolas" w:eastAsia="Consolas"/>
           <w:sz w:val="18"/>
         </w:rPr>
-        <w:t xml:space="preserve">      [requires_human or node error] -&gt; Human review -&gt; END</w:t>
         <w:br/>
+        <w:t xml:space="preserve">      [P0 / legal] -&gt; Safety agent: imminent or legal -&gt; Human review -&gt; END;</w:t>
       </w:r>
       <w:r>
         <w:rPr>
           <w:rFonts w:ascii="Consolas" w:hAnsi="Consolas" w:eastAsia="Consolas"/>
           <w:sz w:val="18"/>
         </w:rPr>
-        <w:t xml:space="preserve"> -&gt; Case Brief     no LLM: facts, conflicts, gaps, trip rules, event timeline,</w:t>
         <w:br/>
+        <w:t xml:space="preserve">                   verbal abuse / minor -&gt; continue with protective actions</w:t>
       </w:r>
       <w:r>
         <w:rPr>
           <w:rFonts w:ascii="Consolas" w:hAnsi="Consolas" w:eastAsia="Consolas"/>
           <w:sz w:val="18"/>
         </w:rPr>
-        <w:t xml:space="preserve">                   base clauses = complaint search (tag-ranked) + type topics + data-triggered topics</w:t>
         <w:br/>
+        <w:t xml:space="preserve"> -&gt; Case Brief     no LLM: facts, conflicts, gaps, trip rules, event timeline, base clauses</w:t>
       </w:r>
       <w:r>
         <w:rPr>
           <w:rFonts w:ascii="Consolas" w:hAnsi="Consolas" w:eastAsia="Consolas"/>
           <w:sz w:val="18"/>
         </w:rPr>
-        <w:t xml:space="preserve"> -&gt; Debate         Passenger and Driver openings, Policy compliance check;</w:t>
         <w:br/>
+        <w:t xml:space="preserve"> -&gt; Fraud          code-scored signals; MEDIUM/HIGH shown to Judge and Fairness only</w:t>
       </w:r>
       <w:r>
         <w:rPr>
           <w:rFonts w:ascii="Consolas" w:hAnsi="Consolas" w:eastAsia="Consolas"/>
           <w:sz w:val="18"/>
         </w:rPr>
-        <w:t xml:space="preserve">                   advocates may request &lt;= 2 catalogue topics -&gt; shared clause pool;</w:t>
         <w:br/>
+        <w:t xml:space="preserve">      [threat in the chat] -&gt; Safety agent (as above)</w:t>
       </w:r>
       <w:r>
         <w:rPr>
           <w:rFonts w:ascii="Consolas" w:hAnsi="Consolas" w:eastAsia="Consolas"/>
           <w:sz w:val="18"/>
         </w:rPr>
-        <w:t xml:space="preserve">                   rebuttal rounds (1 by default); stops at once if the daily quota is exhausted</w:t>
         <w:br/>
+        <w:t xml:space="preserve"> -&gt; Triage         code only: simple/complex x safe/dangerous -&gt; rounds, audit depth</w:t>
       </w:r>
       <w:r>
         <w:rPr>
           <w:rFonts w:ascii="Consolas" w:hAnsi="Consolas" w:eastAsia="Consolas"/>
           <w:sz w:val="18"/>
         </w:rPr>
-        <w:t xml:space="preserve"> -&gt; Arbitrator     reads the brief first, then both sides, policy check and debate;</w:t>
         <w:br/>
+        <w:t xml:space="preserve"> -&gt; Debate         openings + Policy check; advocates may request &lt;= 2 topics;</w:t>
       </w:r>
       <w:r>
         <w:rPr>
           <w:rFonts w:ascii="Consolas" w:hAnsi="Consolas" w:eastAsia="Consolas"/>
           <w:sz w:val="18"/>
         </w:rPr>
-        <w:t xml:space="preserve">                   citations outside the retrieved clauses / trip rules are stripped;</w:t>
         <w:br/>
+        <w:t xml:space="preserve">                   1 rebuttal round; complex: a 2nd only if a side reports NEW_POINT</w:t>
       </w:r>
       <w:r>
         <w:rPr>
           <w:rFonts w:ascii="Consolas" w:hAnsi="Consolas" w:eastAsia="Consolas"/>
           <w:sz w:val="18"/>
         </w:rPr>
-        <w:t xml:space="preserve">                   label follows the refund</w:t>
         <w:br/>
+        <w:t xml:space="preserve"> -&gt; Arbitrator     reads the brief first, then both sides, policy check and debate;</w:t>
       </w:r>
       <w:r>
         <w:rPr>
           <w:rFonts w:ascii="Consolas" w:hAnsi="Consolas" w:eastAsia="Consolas"/>
           <w:sz w:val="18"/>
         </w:rPr>
-        <w:t xml:space="preserve"> -&gt; Fairness       deterministic checks, then an LLM review only if still ambiguous</w:t>
         <w:br/>
+        <w:t xml:space="preserve">                   citations outside the retrieved clauses / trip rules are stripped</w:t>
       </w:r>
       <w:r>
         <w:rPr>
           <w:rFonts w:ascii="Consolas" w:hAnsi="Consolas" w:eastAsia="Consolas"/>
           <w:sz w:val="18"/>
         </w:rPr>
-        <w:t xml:space="preserve">      [human_review_needed, high-severity finding, or no assessment] -&gt; Human review -&gt; END</w:t>
         <w:br/>
+        <w:t xml:space="preserve"> -&gt; Fairness       code checks always; LLM review unless simple and safe</w:t>
       </w:r>
       <w:r>
         <w:rPr>
           <w:rFonts w:ascii="Consolas" w:hAnsi="Consolas" w:eastAsia="Consolas"/>
           <w:sz w:val="18"/>
         </w:rPr>
+        <w:br/>
+        <w:t xml:space="preserve">      [review needed, high-severity finding, fraud HIGH] -&gt; Human review -&gt; END</w:t>
+      </w:r>
+      <w:r>
+        <w:rPr>
+          <w:rFonts w:ascii="Consolas" w:hAnsi="Consolas" w:eastAsia="Consolas"/>
+          <w:sz w:val="18"/>
+        </w:rPr>
+        <w:br/>
         <w:t xml:space="preserve"> -&gt; Executor       simulated refund / penalty / notifications; ruling recorded -&gt; END</w:t>
       </w:r>
     </w:p>
@@ -3551,13 +4493,18 @@
         <w:pStyle w:val="ListParagraph"/>
       </w:pPr>
       <w:r>
-        <w:rPr>
-          <w:b/>
-        </w:rPr>
-        <w:t xml:space="preserve">•  Classifier gate: </w:t>
-      </w:r>
-      <w:r>
-        <w:t>P0 safety or legal keywords, or an unclassifiable case → human review, the debate is skipped.</w:t>
+        <w:rPr/>
+        <w:t xml:space="preserve">•  </w:t>
+      </w:r>
+      <w:r>
+        <w:rPr>
+          <w:b/>
+        </w:rPr>
+        <w:t xml:space="preserve">Classifier gate:</w:t>
+      </w:r>
+      <w:r>
+        <w:rPr/>
+        <w:t xml:space="preserve"> a P0 safety or legal report goes to the Safety agent, which sends imminent harm and legal threats to a person before any debate; an unclassifiable case goes to a person.</w:t>
       </w:r>
     </w:p>
     <w:p>
@@ -3579,6 +4526,25 @@
         <w:pStyle w:val="ListParagraph"/>
       </w:pPr>
       <w:r>
+        <w:rPr/>
+        <w:t xml:space="preserve">•  </w:t>
+      </w:r>
+      <w:r>
+        <w:rPr>
+          <w:b/>
+        </w:rPr>
+        <w:t xml:space="preserve">Triage:</w:t>
+      </w:r>
+      <w:r>
+        <w:rPr/>
+        <w:t xml:space="preserve"> computed in code from the Case Brief, the fraud report and the classification; a signal can raise a grade, never lower it.</w:t>
+      </w:r>
+    </w:p>
+    <w:p>
+      <w:pPr>
+        <w:pStyle w:val="ListParagraph"/>
+      </w:pPr>
+      <w:r>
         <w:rPr>
           <w:b/>
         </w:rPr>
@@ -3621,13 +4587,18 @@
         <w:pStyle w:val="ListParagraph"/>
       </w:pPr>
       <w:r>
-        <w:rPr>
-          <w:b/>
-        </w:rPr>
-        <w:t xml:space="preserve">•  Bounded: </w:t>
-      </w:r>
-      <w:r>
-        <w:t>one rebuttal round by default, at most two topic requests per advocate, one JSON retry, provider pacing for the free tier.</w:t>
+        <w:rPr/>
+        <w:t xml:space="preserve">•  </w:t>
+      </w:r>
+      <w:r>
+        <w:rPr>
+          <w:b/>
+        </w:rPr>
+        <w:t xml:space="preserve">Bounded:</w:t>
+      </w:r>
+      <w:r>
+        <w:rPr/>
+        <w:t xml:space="preserve"> one rebuttal round, two on complex cases only when a side reports a new point; at most two topic requests per advocate; one JSON retry; provider pacing for the free tier.</w:t>
       </w:r>
     </w:p>
     <w:p>
@@ -4217,7 +5188,7 @@
         <w:rPr>
           <w:i w:val="0"/>
         </w:rPr>
-        <w:t>Unit and integration tests: 368 passing (Pytest), covering every agent, the workflow routes, the Collector tools, retrieval ranking, the Case Brief, the guards and the evaluation scoring. The cases below are real end-to-end runs from the 1/10 evaluation (Cerebras gpt-oss-120b).</w:t>
+        <w:t xml:space="preserve">Unit and integration tests: 436 passing (Pytest), with every LLM agent stubbed so the suite spends no quota. They cover every agent, the workflow routes (including the Safety tiers and triage), the Collector tools, retrieval ranking, the Case Brief, the guards, the fraud signals and the evaluation scoring. The cases below are real end-to-end runs (Cerebras gpt-oss-120b).</w:t>
       </w:r>
     </w:p>
     <w:p>
@@ -4499,7 +5470,23 @@
         <w:pStyle w:val="ListParagraph"/>
       </w:pPr>
       <w:r>
-        <w:t>•  Safety incident (SI-001): escalated by the Classifier before any debate.</w:t>
+        <w:t xml:space="preserve">•  Safety incident (SI-001): sexual remarks and "I know where you stay" are decided in code as imminent, with no LLM call, and the case goes to a person before any debate.</w:t>
+      </w:r>
+    </w:p>
+    <w:p>
+      <w:pPr>
+        <w:pStyle w:val="ListParagraph"/>
+      </w:pPr>
+      <w:r>
+        <w:t xml:space="preserve">•  Fraud (CR-004): the fourth "the driver told me to cancel" request in 60 days, while GPS shows the driver waiting and the chat holds no request: dismissed, with the history shown as context only.</w:t>
+      </w:r>
+    </w:p>
+    <w:p>
+      <w:pPr>
+        <w:pStyle w:val="ListParagraph"/>
+      </w:pPr>
+      <w:r>
+        <w:t xml:space="preserve">•  Record does not decide (NS-006): a driver whose no-show fees riders often win back, but who waited past the threshold this time: dismissed, as the trip data says.</w:t>
       </w:r>
     </w:p>
     <w:p>
@@ -4597,6 +5584,57 @@
     </w:p>
     <w:p>
       <w:pPr>
+        <w:pStyle w:val="Heading3"/>
+      </w:pPr>
+      <w:r>
+        <w:t xml:space="preserve">Failure 6 — Suspecting the victim (6/10)</w:t>
+      </w:r>
+    </w:p>
+    <w:p>
+      <w:pPr/>
+      <w:r>
+        <w:rPr>
+          <w:i w:val="0"/>
+        </w:rPr>
+        <w:t xml:space="preserve">A threat in the chat was scored as a fraud signal and flagged both parties, so a rider who was threatened ended up with a fraud report. Fix: threats became safety alerts with no fraud signal and no flag on anyone. Lesson: a signal must say something about the question it is used for.</w:t>
+      </w:r>
+    </w:p>
+    <w:p>
+      <w:pPr>
+        <w:pStyle w:val="Heading3"/>
+      </w:pPr>
+      <w:r>
+        <w:t xml:space="preserve">Failure 7 — Tests that spent real quota (7/10)</w:t>
+      </w:r>
+    </w:p>
+    <w:p>
+      <w:pPr/>
+      <w:r>
+        <w:rPr>
+          <w:i w:val="0"/>
+        </w:rPr>
+        <w:t xml:space="preserve">Unit tests built the workflow without a Safety stub, so three of them called a real LLM; a stopped evaluation left its process running and a second copy ran on the same keys. Fix: every LLM agent is stubbed in tests, one evaluation process at a time, and every run folder records its commit. Lesson: infrastructure faults look like model results unless each run says what produced it.</w:t>
+      </w:r>
+    </w:p>
+    <w:p>
+      <w:pPr>
+        <w:pStyle w:val="Heading3"/>
+      </w:pPr>
+      <w:r>
+        <w:t xml:space="preserve">Failure 8 — An architecture that did not pay off (7–9/10)</w:t>
+      </w:r>
+    </w:p>
+    <w:p>
+      <w:pPr/>
+      <w:r>
+        <w:rPr>
+          <w:i w:val="0"/>
+        </w:rPr>
+        <w:t xml:space="preserve">Advocate research, numbered pools, typed moves and a structured Judge each made sense on single cases, and the architecture was easier to audit. Three full runs scored 31–32/37 against the baseline's 35/37, at 42–47% more tokens. We kept the baseline and took over only triage and the Safety tiers. Lesson: judge an architecture on the full set against a fixed rollback rule, not on the cases that inspired it.</w:t>
+      </w:r>
+    </w:p>
+    <w:p>
+      <w:pPr>
         <w:pStyle w:val="Heading2"/>
       </w:pPr>
       <w:r>
@@ -4617,7 +5655,7 @@
         <w:pStyle w:val="ListParagraph"/>
       </w:pPr>
       <w:r>
-        <w:t>•  P0 safety or legal signals (accident, injury, assault, police, lawsuit) — before any debate;</w:t>
+        <w:t xml:space="preserve">•  imminent harm (physical, sexual, stalking) or legal threats (police, lawsuit) — before any debate, decided in code where the wording is clear; verbal abuse is ruled on the money with protective actions and reviewed by a person afterwards;</w:t>
       </w:r>
     </w:p>
     <w:p>
@@ -4665,6 +5703,14 @@
         <w:pStyle w:val="ListParagraph"/>
       </w:pPr>
       <w:r>
+        <w:t xml:space="preserve">•  the fraud report contains hard evidence of fraud or collusion (HIGH);</w:t>
+      </w:r>
+    </w:p>
+    <w:p>
+      <w:pPr>
+        <w:pStyle w:val="ListParagraph"/>
+      </w:pPr>
+      <w:r>
         <w:t>•  any agent fails, or the provider's quota runs out mid-case.</w:t>
       </w:r>
     </w:p>
@@ -4754,12 +5800,114 @@
       </w:r>
     </w:p>
     <w:p>
+      <w:pPr>
+        <w:pStyle w:val="Heading3"/>
+      </w:pPr>
+      <w:r>
+        <w:t xml:space="preserve">Usage 5 — Advocate evidence gathering (05–08)</w:t>
+      </w:r>
+    </w:p>
+    <w:p>
+      <w:pPr/>
+      <w:r>
+        <w:rPr>
+          <w:i w:val="0"/>
+        </w:rPr>
+        <w:t xml:space="preserve">Planned how advocates could gather evidence themselves: the request and task plan, a diagnosis of how advocates got evidence, the target auto-query architecture and the evidence-pool data model. Evidence: screenshots 05–08.</w:t>
+      </w:r>
+    </w:p>
+    <w:p>
+      <w:pPr>
+        <w:pStyle w:val="Heading3"/>
+      </w:pPr>
+      <w:r>
+        <w:t xml:space="preserve">Usage 6 — How much autonomy (09–12)</w:t>
+      </w:r>
+    </w:p>
+    <w:p>
+      <w:pPr/>
+      <w:r>
+        <w:rPr>
+          <w:i w:val="0"/>
+        </w:rPr>
+        <w:t xml:space="preserve">Discussed agent memory and self-directed tool loops, compared full autonomy with constrained autonomy on tokens, latency and testability, and chose zero-token queries plus one LLM decision per turn. Evidence: screenshots 09–12.</w:t>
+      </w:r>
+    </w:p>
+    <w:p>
+      <w:pPr>
+        <w:pStyle w:val="Heading3"/>
+      </w:pPr>
+      <w:r>
+        <w:t xml:space="preserve">Usage 7 — Query timing and complex tests (13–17)</w:t>
+      </w:r>
+    </w:p>
+    <w:p>
+      <w:pPr/>
+      <w:r>
+        <w:rPr>
+          <w:i w:val="0"/>
+        </w:rPr>
+        <w:t xml:space="preserve">When advocates should query (opening or rebuttal), layered query timing, five complex end-to-end test cases, fixes to the query-planner rules they exposed, and the full test suite passing. Evidence: screenshots 13–17.</w:t>
+      </w:r>
+    </w:p>
+    <w:p>
+      <w:pPr>
+        <w:pStyle w:val="Heading3"/>
+      </w:pPr>
+      <w:r>
+        <w:t xml:space="preserve">Usage 8 — Evaluation and token cost (18–22)</w:t>
+      </w:r>
+    </w:p>
+    <w:p>
+      <w:pPr/>
+      <w:r>
+        <w:rPr>
+          <w:i w:val="0"/>
+        </w:rPr>
+        <w:t xml:space="preserve">Ran the full evaluation, analysed prompt-token cost, made a rollback baseline before an A/B test, found that clause truncation caused an accuracy drop, and analysed the errors on the sealed set. Evidence: screenshots 18–22.</w:t>
+      </w:r>
+    </w:p>
+    <w:p>
+      <w:pPr>
+        <w:pStyle w:val="Heading3"/>
+      </w:pPr>
+      <w:r>
+        <w:t xml:space="preserve">Usage 9 — Adaptive debate, triage and Safety agent (23–26)</w:t>
+      </w:r>
+    </w:p>
+    <w:p>
+      <w:pPr/>
+      <w:r>
+        <w:rPr>
+          <w:i w:val="0"/>
+        </w:rPr>
+        <w:t xml:space="preserve">Proposed adaptive debate (simple cases debate briefly, complex ones longer), a classifier-style triage of complexity and danger, Fairness only where needed, and a Safety agent that uses human-reviewed precedents; CodeBuddy reviewed the fixed-round debate code and proposed a phased plan. This design became feature/adaptive-triage. Evidence: screenshots 23–26.</w:t>
+      </w:r>
+    </w:p>
+    <w:p>
+      <w:pPr>
+        <w:pStyle w:val="Heading3"/>
+      </w:pPr>
+      <w:r>
+        <w:t xml:space="preserve">Usage 10 — Judge fee and refund rulings (27–28)</w:t>
+      </w:r>
+    </w:p>
+    <w:p>
+      <w:pPr/>
+      <w:r>
+        <w:rPr>
+          <w:i w:val="0"/>
+        </w:rPr>
+        <w:t xml:space="preserve">Asked CodeBuddy to analyse the Judge's fee judgements; it traced how refund_amount null and 0 were scored and where the prompt left them ambiguous. Evidence: screenshots 27–28.</w:t>
+      </w:r>
+    </w:p>
+    <w:p>
       <w:pPr/>
       <w:r>
         <w:rPr>
           <w:i/>
         </w:rPr>
-        <w:t>Further CodeBuddy sessions from the agent and debugging work still need their screenshots attached to this section.</w:t>
+        <w:t xml:space="preserve">All screenshots are in the "proof of usage of codebuddy" folder (01–28).</w:t>
       </w:r>
     </w:p>
     <w:p>
@@ -5203,6 +6351,132 @@
           </w:p>
         </w:tc>
       </w:tr>
+      <w:tr>
+        <w:tc>
+          <w:tcPr>
+            <w:tcW w:type="dxa" w:w="2256"/>
+          </w:tcPr>
+          <w:p>
+            <w:r>
+              <w:t xml:space="preserve">V7</w:t>
+            </w:r>
+          </w:p>
+        </w:tc>
+        <w:tc>
+          <w:tcPr>
+            <w:tcW w:type="dxa" w:w="2256"/>
+          </w:tcPr>
+          <w:p>
+            <w:r>
+              <w:t xml:space="preserve">6/10</w:t>
+            </w:r>
+          </w:p>
+        </w:tc>
+        <w:tc>
+          <w:tcPr>
+            <w:tcW w:type="dxa" w:w="2256"/>
+          </w:tcPr>
+          <w:p>
+            <w:r>
+              <w:t xml:space="preserve">+ Fraud &amp; Bad-Faith agent; threats as safety alerts</w:t>
+            </w:r>
+          </w:p>
+        </w:tc>
+        <w:tc>
+          <w:tcPr>
+            <w:tcW w:type="dxa" w:w="2256"/>
+          </w:tcPr>
+          <w:p>
+            <w:r>
+              <w:t xml:space="preserve">No check for claims made in bad faith</w:t>
+            </w:r>
+          </w:p>
+        </w:tc>
+      </w:tr>
+      <w:tr>
+        <w:tc>
+          <w:tcPr>
+            <w:tcW w:type="dxa" w:w="2256"/>
+          </w:tcPr>
+          <w:p>
+            <w:r>
+              <w:t xml:space="preserve">V8 (experimental)</w:t>
+            </w:r>
+          </w:p>
+        </w:tc>
+        <w:tc>
+          <w:tcPr>
+            <w:tcW w:type="dxa" w:w="2256"/>
+          </w:tcPr>
+          <w:p>
+            <w:r>
+              <w:t xml:space="preserve">7–9/10</w:t>
+            </w:r>
+          </w:p>
+        </w:tc>
+        <w:tc>
+          <w:tcPr>
+            <w:tcW w:type="dxa" w:w="2256"/>
+          </w:tcPr>
+          <w:p>
+            <w:r>
+              <w:t xml:space="preserve">+ evidence pools, advocate research, typed moves, Judge remand, structured Judge</w:t>
+            </w:r>
+          </w:p>
+        </w:tc>
+        <w:tc>
+          <w:tcPr>
+            <w:tcW w:type="dxa" w:w="2256"/>
+          </w:tcPr>
+          <w:p>
+            <w:r>
+              <w:t xml:space="preserve">Measured: 31–32/37 at +42–47% tokens; not adopted</w:t>
+            </w:r>
+          </w:p>
+        </w:tc>
+      </w:tr>
+      <w:tr>
+        <w:tc>
+          <w:tcPr>
+            <w:tcW w:type="dxa" w:w="2256"/>
+          </w:tcPr>
+          <w:p>
+            <w:r>
+              <w:t xml:space="preserve">V9</w:t>
+            </w:r>
+          </w:p>
+        </w:tc>
+        <w:tc>
+          <w:tcPr>
+            <w:tcW w:type="dxa" w:w="2256"/>
+          </w:tcPr>
+          <w:p>
+            <w:r>
+              <w:t xml:space="preserve">9/10</w:t>
+            </w:r>
+          </w:p>
+        </w:tc>
+        <w:tc>
+          <w:tcPr>
+            <w:tcW w:type="dxa" w:w="2256"/>
+          </w:tcPr>
+          <w:p>
+            <w:r>
+              <w:t xml:space="preserve">V7 + code triage, tiered Safety agent, Fairness audit depth, round cap</w:t>
+            </w:r>
+          </w:p>
+        </w:tc>
+        <w:tc>
+          <w:tcPr>
+            <w:tcW w:type="dxa" w:w="2256"/>
+          </w:tcPr>
+          <w:p>
+            <w:r>
+              <w:t xml:space="preserve">Every threat sent the whole case to a person; the same process for every case</w:t>
+            </w:r>
+          </w:p>
+        </w:tc>
+      </w:tr>
     </w:tbl>
     <w:p/>
     <w:p>
@@ -5298,12 +6572,11 @@
             <w:tcW w:type="dxa" w:w="4513"/>
           </w:tcPr>
           <w:p>
-            <w:r/>
-            <w:r>
-              <w:rPr>
-                <w:sz w:val="19"/>
-              </w:rPr>
-              <w:t>Classifier</w:t>
+            <w:r>
+              <w:rPr>
+                <w:sz w:val="19"/>
+              </w:rPr>
+              <w:t xml:space="preserve">Classifier</w:t>
             </w:r>
           </w:p>
         </w:tc>
@@ -5312,12 +6585,11 @@
             <w:tcW w:type="dxa" w:w="4513"/>
           </w:tcPr>
           <w:p>
-            <w:r/>
-            <w:r>
-              <w:rPr>
-                <w:sz w:val="19"/>
-              </w:rPr>
-              <w:t>Dispute type and urgency; P0 safety keywords escalate before any LLM step.</w:t>
+            <w:r>
+              <w:rPr>
+                <w:sz w:val="19"/>
+              </w:rPr>
+              <w:t xml:space="preserve">Dispute type and urgency; a P0 safety or legal report goes to the Safety agent before any debate.</w:t>
             </w:r>
           </w:p>
         </w:tc>
@@ -5328,12 +6600,11 @@
             <w:tcW w:type="dxa" w:w="4513"/>
           </w:tcPr>
           <w:p>
-            <w:r/>
-            <w:r>
-              <w:rPr>
-                <w:sz w:val="19"/>
-              </w:rPr>
-              <w:t>Case Brief</w:t>
+            <w:r>
+              <w:rPr>
+                <w:sz w:val="19"/>
+              </w:rPr>
+              <w:t xml:space="preserve">Safety agent</w:t>
             </w:r>
           </w:p>
         </w:tc>
@@ -5342,12 +6613,11 @@
             <w:tcW w:type="dxa" w:w="4513"/>
           </w:tcPr>
           <w:p>
-            <w:r/>
-            <w:r>
-              <w:rPr>
-                <w:sz w:val="19"/>
-              </w:rPr>
-              <w:t>Shared dossier for every agent: verified facts, conflicts, trip rules, timeline, base clauses (no LLM).</w:t>
+            <w:r>
+              <w:rPr>
+                <w:sz w:val="19"/>
+              </w:rPr>
+              <w:t xml:space="preserve">Tiers a safety report: imminent harm or legal → a person now; verbal abuse → protective actions, money ruled, a person reviews after. Code decides clear wording; failure counts as imminent.</w:t>
             </w:r>
           </w:p>
         </w:tc>
@@ -5363,7 +6633,7 @@
               <w:rPr>
                 <w:sz w:val="19"/>
               </w:rPr>
-              <w:t>Rider Advocate / Driver Advocate</w:t>
+              <w:t>Case Brief</w:t>
             </w:r>
           </w:p>
         </w:tc>
@@ -5377,7 +6647,7 @@
               <w:rPr>
                 <w:sz w:val="19"/>
               </w:rPr>
-              <w:t>Evidence-grounded arguments for each side; may request two policy topics, shared with both sides.</w:t>
+              <w:t>Shared dossier for every agent: verified facts, conflicts, trip rules, timeline, base clauses (no LLM).</w:t>
             </w:r>
           </w:p>
         </w:tc>
@@ -5388,12 +6658,11 @@
             <w:tcW w:type="dxa" w:w="4513"/>
           </w:tcPr>
           <w:p>
-            <w:r/>
-            <w:r>
-              <w:rPr>
-                <w:sz w:val="19"/>
-              </w:rPr>
-              <w:t>Policy agent</w:t>
+            <w:r>
+              <w:rPr>
+                <w:sz w:val="19"/>
+              </w:rPr>
+              <w:t xml:space="preserve">Fraud agent</w:t>
             </w:r>
           </w:p>
         </w:tc>
@@ -5402,12 +6671,11 @@
             <w:tcW w:type="dxa" w:w="4513"/>
           </w:tcPr>
           <w:p>
-            <w:r/>
-            <w:r>
-              <w:rPr>
-                <w:sz w:val="19"/>
-              </w:rPr>
-              <w:t>Checks both parties' compliance against the clauses and every trip rule.</w:t>
+            <w:r>
+              <w:rPr>
+                <w:sz w:val="19"/>
+              </w:rPr>
+              <w:t xml:space="preserve">Code-scored bad-faith signals from history, timing and chat; shown to the Judge and Fairness only; hard evidence → a person.</w:t>
             </w:r>
           </w:p>
         </w:tc>
@@ -5418,12 +6686,11 @@
             <w:tcW w:type="dxa" w:w="4513"/>
           </w:tcPr>
           <w:p>
-            <w:r/>
-            <w:r>
-              <w:rPr>
-                <w:sz w:val="19"/>
-              </w:rPr>
-              <w:t>Debate engine</w:t>
+            <w:r>
+              <w:rPr>
+                <w:sz w:val="19"/>
+              </w:rPr>
+              <w:t xml:space="preserve">Triage</w:t>
             </w:r>
           </w:p>
         </w:tc>
@@ -5432,12 +6699,11 @@
             <w:tcW w:type="dxa" w:w="4513"/>
           </w:tcPr>
           <w:p>
-            <w:r/>
-            <w:r>
-              <w:rPr>
-                <w:sz w:val="19"/>
-              </w:rPr>
-              <w:t>Rebuttal rounds; stops cleanly on provider quota exhaustion.</w:t>
+            <w:r>
+              <w:rPr>
+                <w:sz w:val="19"/>
+              </w:rPr>
+              <w:t xml:space="preserve">Code only: complexity × risk from conflicts, gaps, fraud risk, disputed amount, P0 and chat threats; sets debate rounds and audit depth.</w:t>
             </w:r>
           </w:p>
         </w:tc>
@@ -5453,7 +6719,7 @@
               <w:rPr>
                 <w:sz w:val="19"/>
               </w:rPr>
-              <w:t>Arbitrator (Judge)</w:t>
+              <w:t>Rider Advocate / Driver Advocate</w:t>
             </w:r>
           </w:p>
         </w:tc>
@@ -5467,7 +6733,7 @@
               <w:rPr>
                 <w:sz w:val="19"/>
               </w:rPr>
-              <w:t>Verdict, refund and rationale with citations; the label follows the refund.</w:t>
+              <w:t>Evidence-grounded arguments for each side; may request two policy topics, shared with both sides.</w:t>
             </w:r>
           </w:p>
         </w:tc>
@@ -5483,7 +6749,7 @@
               <w:rPr>
                 <w:sz w:val="19"/>
               </w:rPr>
-              <w:t>Fairness agent</w:t>
+              <w:t>Policy agent</w:t>
             </w:r>
           </w:p>
         </w:tc>
@@ -5497,7 +6763,93 @@
               <w:rPr>
                 <w:sz w:val="19"/>
               </w:rPr>
-              <w:t>Independent audit: deterministic checks plus an LLM review; can block execution.</w:t>
+              <w:t>Checks both parties' compliance against the clauses and every trip rule.</w:t>
+            </w:r>
+          </w:p>
+        </w:tc>
+      </w:tr>
+      <w:tr>
+        <w:tc>
+          <w:tcPr>
+            <w:tcW w:type="dxa" w:w="4513"/>
+          </w:tcPr>
+          <w:p>
+            <w:r>
+              <w:rPr>
+                <w:sz w:val="19"/>
+              </w:rPr>
+              <w:t xml:space="preserve">Debate engine</w:t>
+            </w:r>
+          </w:p>
+        </w:tc>
+        <w:tc>
+          <w:tcPr>
+            <w:tcW w:type="dxa" w:w="4513"/>
+          </w:tcPr>
+          <w:p>
+            <w:r>
+              <w:rPr>
+                <w:sz w:val="19"/>
+              </w:rPr>
+              <w:t xml:space="preserve">Rebuttal rounds as triage allows (a second only on complex cases when a side reports a new point); stops cleanly on provider quota exhaustion.</w:t>
+            </w:r>
+          </w:p>
+        </w:tc>
+      </w:tr>
+      <w:tr>
+        <w:tc>
+          <w:tcPr>
+            <w:tcW w:type="dxa" w:w="4513"/>
+          </w:tcPr>
+          <w:p>
+            <w:r/>
+            <w:r>
+              <w:rPr>
+                <w:sz w:val="19"/>
+              </w:rPr>
+              <w:t>Arbitrator (Judge)</w:t>
+            </w:r>
+          </w:p>
+        </w:tc>
+        <w:tc>
+          <w:tcPr>
+            <w:tcW w:type="dxa" w:w="4513"/>
+          </w:tcPr>
+          <w:p>
+            <w:r/>
+            <w:r>
+              <w:rPr>
+                <w:sz w:val="19"/>
+              </w:rPr>
+              <w:t>Verdict, refund and rationale with citations; the label follows the refund.</w:t>
+            </w:r>
+          </w:p>
+        </w:tc>
+      </w:tr>
+      <w:tr>
+        <w:tc>
+          <w:tcPr>
+            <w:tcW w:type="dxa" w:w="4513"/>
+          </w:tcPr>
+          <w:p>
+            <w:r>
+              <w:rPr>
+                <w:sz w:val="19"/>
+              </w:rPr>
+              <w:t xml:space="preserve">Fairness agent</w:t>
+            </w:r>
+          </w:p>
+        </w:tc>
+        <w:tc>
+          <w:tcPr>
+            <w:tcW w:type="dxa" w:w="4513"/>
+          </w:tcPr>
+          <w:p>
+            <w:r>
+              <w:rPr>
+                <w:sz w:val="19"/>
+              </w:rPr>
+              <w:t xml:space="preserve">Independent audit: deterministic checks on every case, plus an LLM review unless the case is simple and safe; can block execution.</w:t>
             </w:r>
           </w:p>
         </w:tc>
@@ -5608,7 +6960,7 @@
         <w:rPr>
           <w:i w:val="0"/>
         </w:rPr>
-        <w:t>Latest full run (5/10, run 20261005-131434, 33 cases: 14 dev + 19 held-out, Cerebras gpt-oss-120b, full debates, final code):</w:t>
+        <w:t xml:space="preserve">Latest complete full run on merged code (6/10, run 20261005-171730, 37 cases: 14 dev, 19 held-out, 4 fraud; Cerebras gpt-oss-120b, full debates). The adaptive-triage version (9/10, run 20261009-164028, 38 cases) scored verdict 35/38 (92.1%), refund 28/31, classification 100%, P0 1/1, missing-data escalation 5/5, citation validity 100%, Hit@3 97%, 0 failed runs, about 28.2k tokens and US$0.012 per case; all three misses went to a person.</w:t>
       </w:r>
     </w:p>
     <w:tbl>
@@ -5682,12 +7034,11 @@
             <w:tcW w:type="dxa" w:w="3009"/>
           </w:tcPr>
           <w:p>
-            <w:r/>
-            <w:r>
-              <w:rPr>
-                <w:sz w:val="19"/>
-              </w:rPr>
-              <w:t>Verdict accuracy</w:t>
+            <w:r>
+              <w:rPr>
+                <w:sz w:val="19"/>
+              </w:rPr>
+              <w:t xml:space="preserve">Verdict accuracy</w:t>
             </w:r>
           </w:p>
         </w:tc>
@@ -5696,12 +7047,11 @@
             <w:tcW w:type="dxa" w:w="3009"/>
           </w:tcPr>
           <w:p>
-            <w:r/>
-            <w:r>
-              <w:rPr>
-                <w:sz w:val="19"/>
-              </w:rPr>
-              <w:t>≥ 85%</w:t>
+            <w:r>
+              <w:rPr>
+                <w:sz w:val="19"/>
+              </w:rPr>
+              <w:t xml:space="preserve">≥ 85%</w:t>
             </w:r>
           </w:p>
         </w:tc>
@@ -5711,12 +7061,10 @@
           </w:tcPr>
           <w:p>
             <w:r>
-              <w:t>94% (31/33; dev 13/14, held-out 18/19)</w:t>
-            </w:r>
-            <w:r>
-              <w:rPr>
-                <w:sz w:val="19"/>
-              </w:rPr>
+              <w:rPr>
+                <w:sz w:val="19"/>
+              </w:rPr>
+              <w:t xml:space="preserve">95% (35/37)</w:t>
             </w:r>
           </w:p>
         </w:tc>
@@ -5727,12 +7075,11 @@
             <w:tcW w:type="dxa" w:w="3009"/>
           </w:tcPr>
           <w:p>
-            <w:r/>
-            <w:r>
-              <w:rPr>
-                <w:sz w:val="19"/>
-              </w:rPr>
-              <w:t>Refund accuracy</w:t>
+            <w:r>
+              <w:rPr>
+                <w:sz w:val="19"/>
+              </w:rPr>
+              <w:t xml:space="preserve">Fraud cases</w:t>
             </w:r>
           </w:p>
         </w:tc>
@@ -5741,12 +7088,11 @@
             <w:tcW w:type="dxa" w:w="3009"/>
           </w:tcPr>
           <w:p>
-            <w:r/>
-            <w:r>
-              <w:rPr>
-                <w:sz w:val="19"/>
-              </w:rPr>
-              <w:t>≥ 85%</w:t>
+            <w:r>
+              <w:rPr>
+                <w:sz w:val="19"/>
+              </w:rPr>
+              <w:t xml:space="preserve">—</w:t>
             </w:r>
           </w:p>
         </w:tc>
@@ -5756,12 +7102,10 @@
           </w:tcPr>
           <w:p>
             <w:r>
-              <w:t>93% (25/27)</w:t>
-            </w:r>
-            <w:r>
-              <w:rPr>
-                <w:sz w:val="19"/>
-              </w:rPr>
+              <w:rPr>
+                <w:sz w:val="19"/>
+              </w:rPr>
+              <w:t xml:space="preserve">4/4 correct</w:t>
             </w:r>
           </w:p>
         </w:tc>
@@ -5772,12 +7116,11 @@
             <w:tcW w:type="dxa" w:w="3009"/>
           </w:tcPr>
           <w:p>
-            <w:r/>
-            <w:r>
-              <w:rPr>
-                <w:sz w:val="19"/>
-              </w:rPr>
-              <w:t>Classification accuracy</w:t>
+            <w:r>
+              <w:rPr>
+                <w:sz w:val="19"/>
+              </w:rPr>
+              <w:t xml:space="preserve">Refund accuracy</w:t>
             </w:r>
           </w:p>
         </w:tc>
@@ -5786,12 +7129,11 @@
             <w:tcW w:type="dxa" w:w="3009"/>
           </w:tcPr>
           <w:p>
-            <w:r/>
-            <w:r>
-              <w:rPr>
-                <w:sz w:val="19"/>
-              </w:rPr>
-              <w:t>≥ 90%</w:t>
+            <w:r>
+              <w:rPr>
+                <w:sz w:val="19"/>
+              </w:rPr>
+              <w:t xml:space="preserve">≥ 85%</w:t>
             </w:r>
           </w:p>
         </w:tc>
@@ -5801,12 +7143,10 @@
           </w:tcPr>
           <w:p>
             <w:r>
-              <w:t>100% (28/28)</w:t>
-            </w:r>
-            <w:r>
-              <w:rPr>
-                <w:sz w:val="19"/>
-              </w:rPr>
+              <w:rPr>
+                <w:sz w:val="19"/>
+              </w:rPr>
+              <w:t xml:space="preserve">93% (27/29)</w:t>
             </w:r>
           </w:p>
         </w:tc>
@@ -5817,12 +7157,11 @@
             <w:tcW w:type="dxa" w:w="3009"/>
           </w:tcPr>
           <w:p>
-            <w:r/>
-            <w:r>
-              <w:rPr>
-                <w:sz w:val="19"/>
-              </w:rPr>
-              <w:t>P0 safety escalation</w:t>
+            <w:r>
+              <w:rPr>
+                <w:sz w:val="19"/>
+              </w:rPr>
+              <w:t xml:space="preserve">Classification accuracy</w:t>
             </w:r>
           </w:p>
         </w:tc>
@@ -5831,12 +7170,11 @@
             <w:tcW w:type="dxa" w:w="3009"/>
           </w:tcPr>
           <w:p>
-            <w:r/>
-            <w:r>
-              <w:rPr>
-                <w:sz w:val="19"/>
-              </w:rPr>
-              <w:t>100%</w:t>
+            <w:r>
+              <w:rPr>
+                <w:sz w:val="19"/>
+              </w:rPr>
+              <w:t xml:space="preserve">≥ 90%</w:t>
             </w:r>
           </w:p>
         </w:tc>
@@ -5845,12 +7183,11 @@
             <w:tcW w:type="dxa" w:w="3009"/>
           </w:tcPr>
           <w:p>
-            <w:r/>
-            <w:r>
-              <w:rPr>
-                <w:sz w:val="19"/>
-              </w:rPr>
-              <w:t>100%</w:t>
+            <w:r>
+              <w:rPr>
+                <w:sz w:val="19"/>
+              </w:rPr>
+              <w:t xml:space="preserve">100% (31/31)</w:t>
             </w:r>
           </w:p>
         </w:tc>
@@ -5866,7 +7203,7 @@
               <w:rPr>
                 <w:sz w:val="19"/>
               </w:rPr>
-              <w:t>Missing-data escalation</w:t>
+              <w:t>P0 safety escalation</w:t>
             </w:r>
           </w:p>
         </w:tc>
@@ -5905,12 +7242,11 @@
             <w:tcW w:type="dxa" w:w="3009"/>
           </w:tcPr>
           <w:p>
-            <w:r/>
-            <w:r>
-              <w:rPr>
-                <w:sz w:val="19"/>
-              </w:rPr>
-              <w:t>Refund never above the charge</w:t>
+            <w:r>
+              <w:rPr>
+                <w:sz w:val="19"/>
+              </w:rPr>
+              <w:t xml:space="preserve">Missing-data escalation</w:t>
             </w:r>
           </w:p>
         </w:tc>
@@ -5919,12 +7255,11 @@
             <w:tcW w:type="dxa" w:w="3009"/>
           </w:tcPr>
           <w:p>
-            <w:r/>
-            <w:r>
-              <w:rPr>
-                <w:sz w:val="19"/>
-              </w:rPr>
-              <w:t>100%</w:t>
+            <w:r>
+              <w:rPr>
+                <w:sz w:val="19"/>
+              </w:rPr>
+              <w:t xml:space="preserve">100%</w:t>
             </w:r>
           </w:p>
         </w:tc>
@@ -5933,12 +7268,11 @@
             <w:tcW w:type="dxa" w:w="3009"/>
           </w:tcPr>
           <w:p>
-            <w:r/>
-            <w:r>
-              <w:rPr>
-                <w:sz w:val="19"/>
-              </w:rPr>
-              <w:t>100%</w:t>
+            <w:r>
+              <w:rPr>
+                <w:sz w:val="19"/>
+              </w:rPr>
+              <w:t xml:space="preserve">100% (6/6)</w:t>
             </w:r>
           </w:p>
         </w:tc>
@@ -5954,7 +7288,7 @@
               <w:rPr>
                 <w:sz w:val="19"/>
               </w:rPr>
-              <w:t>Citation validity</w:t>
+              <w:t>Refund never above the charge</w:t>
             </w:r>
           </w:p>
         </w:tc>
@@ -5968,7 +7302,7 @@
               <w:rPr>
                 <w:sz w:val="19"/>
               </w:rPr>
-              <w:t>≥ 95%</w:t>
+              <w:t>100%</w:t>
             </w:r>
           </w:p>
         </w:tc>
@@ -5998,7 +7332,7 @@
               <w:rPr>
                 <w:sz w:val="19"/>
               </w:rPr>
-              <w:t>Retrieval Hit@3</w:t>
+              <w:t>Citation validity</w:t>
             </w:r>
           </w:p>
         </w:tc>
@@ -6012,7 +7346,7 @@
               <w:rPr>
                 <w:sz w:val="19"/>
               </w:rPr>
-              <w:t>≥ 90%</w:t>
+              <w:t>≥ 95%</w:t>
             </w:r>
           </w:p>
         </w:tc>
@@ -6037,12 +7371,11 @@
             <w:tcW w:type="dxa" w:w="3009"/>
           </w:tcPr>
           <w:p>
-            <w:r/>
-            <w:r>
-              <w:rPr>
-                <w:sz w:val="19"/>
-              </w:rPr>
-              <w:t>Failure rate</w:t>
+            <w:r>
+              <w:rPr>
+                <w:sz w:val="19"/>
+              </w:rPr>
+              <w:t xml:space="preserve">Retrieval Hit@3</w:t>
             </w:r>
           </w:p>
         </w:tc>
@@ -6051,12 +7384,11 @@
             <w:tcW w:type="dxa" w:w="3009"/>
           </w:tcPr>
           <w:p>
-            <w:r/>
-            <w:r>
-              <w:rPr>
-                <w:sz w:val="19"/>
-              </w:rPr>
-              <w:t>&lt; 2%</w:t>
+            <w:r>
+              <w:rPr>
+                <w:sz w:val="19"/>
+              </w:rPr>
+              <w:t xml:space="preserve">≥ 90%</w:t>
             </w:r>
           </w:p>
         </w:tc>
@@ -6065,12 +7397,11 @@
             <w:tcW w:type="dxa" w:w="3009"/>
           </w:tcPr>
           <w:p>
-            <w:r/>
-            <w:r>
-              <w:rPr>
-                <w:sz w:val="19"/>
-              </w:rPr>
-              <w:t>0%</w:t>
+            <w:r>
+              <w:rPr>
+                <w:sz w:val="19"/>
+              </w:rPr>
+              <w:t xml:space="preserve">97% (36/37)</w:t>
             </w:r>
           </w:p>
         </w:tc>
@@ -6086,7 +7417,7 @@
               <w:rPr>
                 <w:sz w:val="19"/>
               </w:rPr>
-              <w:t>Time per case</w:t>
+              <w:t>Failure rate</w:t>
             </w:r>
           </w:p>
         </w:tc>
@@ -6100,7 +7431,7 @@
               <w:rPr>
                 <w:sz w:val="19"/>
               </w:rPr>
-              <w:t>—</w:t>
+              <w:t>&lt; 2%</w:t>
             </w:r>
           </w:p>
         </w:tc>
@@ -6109,13 +7440,12 @@
             <w:tcW w:type="dxa" w:w="3009"/>
           </w:tcPr>
           <w:p>
-            <w:r>
-              <w:t>median 91 s (12 s model time; the rest is free-tier pacing)</w:t>
-            </w:r>
-            <w:r>
-              <w:rPr>
-                <w:sz w:val="19"/>
-              </w:rPr>
+            <w:r/>
+            <w:r>
+              <w:rPr>
+                <w:sz w:val="19"/>
+              </w:rPr>
+              <w:t>0%</w:t>
             </w:r>
           </w:p>
         </w:tc>
@@ -6126,12 +7456,11 @@
             <w:tcW w:type="dxa" w:w="3009"/>
           </w:tcPr>
           <w:p>
-            <w:r/>
-            <w:r>
-              <w:rPr>
-                <w:sz w:val="19"/>
-              </w:rPr>
-              <w:t>Cost per case</w:t>
+            <w:r>
+              <w:rPr>
+                <w:sz w:val="19"/>
+              </w:rPr>
+              <w:t xml:space="preserve">Time per case</w:t>
             </w:r>
           </w:p>
         </w:tc>
@@ -6140,12 +7469,11 @@
             <w:tcW w:type="dxa" w:w="3009"/>
           </w:tcPr>
           <w:p>
-            <w:r/>
-            <w:r>
-              <w:rPr>
-                <w:sz w:val="19"/>
-              </w:rPr>
-              <w:t>—</w:t>
+            <w:r>
+              <w:rPr>
+                <w:sz w:val="19"/>
+              </w:rPr>
+              <w:t xml:space="preserve">—</w:t>
             </w:r>
           </w:p>
         </w:tc>
@@ -6155,12 +7483,51 @@
           </w:tcPr>
           <w:p>
             <w:r>
-              <w:t>about US$0.011 (~26k tokens)</w:t>
-            </w:r>
-            <w:r>
-              <w:rPr>
-                <w:sz w:val="19"/>
-              </w:rPr>
+              <w:rPr>
+                <w:sz w:val="19"/>
+              </w:rPr>
+              <w:t xml:space="preserve">median 103 s (mostly free-tier pacing)</w:t>
+            </w:r>
+          </w:p>
+        </w:tc>
+      </w:tr>
+      <w:tr>
+        <w:tc>
+          <w:tcPr>
+            <w:tcW w:type="dxa" w:w="3009"/>
+          </w:tcPr>
+          <w:p>
+            <w:r>
+              <w:rPr>
+                <w:sz w:val="19"/>
+              </w:rPr>
+              <w:t xml:space="preserve">Cost per case</w:t>
+            </w:r>
+          </w:p>
+        </w:tc>
+        <w:tc>
+          <w:tcPr>
+            <w:tcW w:type="dxa" w:w="3009"/>
+          </w:tcPr>
+          <w:p>
+            <w:r>
+              <w:rPr>
+                <w:sz w:val="19"/>
+              </w:rPr>
+              <w:t xml:space="preserve">—</w:t>
+            </w:r>
+          </w:p>
+        </w:tc>
+        <w:tc>
+          <w:tcPr>
+            <w:tcW w:type="dxa" w:w="3009"/>
+          </w:tcPr>
+          <w:p>
+            <w:r>
+              <w:rPr>
+                <w:sz w:val="19"/>
+              </w:rPr>
+              <w:t xml:space="preserve">about US$0.011 (~26.6k tokens)</w:t>
             </w:r>
           </w:p>
         </w:tc>
@@ -6173,7 +7540,7 @@
         <w:rPr>
           <w:i w:val="0"/>
         </w:rPr>
-        <w:t>Path to this result: the 1/10 confirming run scored 25/27; after the label fix and full debates the set grew to 33 cases and scored 29/33 (2/10), then 30/33 with the payout guards and Judge principles (4/10), then 31/33 in the regression run. Paraphrase 4/4 and injection 3/3 passed; counterfactual 2/3 (NS-002-C1, still sent to a person by the fee-basis check). Both remaining misses go to a person, so no wrong ruling is executed automatically. A stability run on 2/10 repeated the eight cases that had flipped between earlier runs three times each: 24/24 verdicts and refunds correct, consistency 1.0.</w:t>
+        <w:t xml:space="preserve">Path to this result: 25/27 on 1/10; 29/33 with full debates (2/10); 30/33 with the payout guards (4/10); 31/33 in the regression run (5/10); 35/37 with the Fraud agent (6/10). Paraphrase 4/4 and injection 3/3 passed. Both remaining misses (NS-002-B1, NS-002-C1) go to a person, so no wrong ruling is executed automatically. The experimental architecture of 7–9/10 scored 31–32/37 in three full runs and was not adopted (Iteration 16).</w:t>
       </w:r>
     </w:p>
     <w:p>
@@ -6291,6 +7658,33 @@
     </w:p>
     <w:p>
       <w:pPr>
+        <w:pStyle w:val="ListParagraph"/>
+      </w:pPr>
+      <w:r>
+        <w:rPr/>
+        <w:t xml:space="preserve">•  More autonomy is not more accuracy. Three full runs of a more autonomous architecture scored below the simpler pipeline at 40–50% more cost; a fixed rollback rule made that call easy.</w:t>
+      </w:r>
+    </w:p>
+    <w:p>
+      <w:pPr>
+        <w:pStyle w:val="ListParagraph"/>
+      </w:pPr>
+      <w:r>
+        <w:rPr/>
+        <w:t xml:space="preserve">•  Safety needs tiers, not a switch. Sending every threat to a person also stopped the money part of ordinary disputes; imminent harm still goes to a person at once.</w:t>
+      </w:r>
+    </w:p>
+    <w:p>
+      <w:pPr>
+        <w:pStyle w:val="ListParagraph"/>
+      </w:pPr>
+      <w:r>
+        <w:rPr/>
+        <w:t xml:space="preserve">•  Know what produced a number. Every run folder now records its commit, and checks on recorded runs come before paid runs.</w:t>
+      </w:r>
+    </w:p>
+    <w:p>
+      <w:pPr>
         <w:pStyle w:val="Heading2"/>
       </w:pPr>
       <w:r>
@@ -6302,23 +7696,23 @@
         <w:pStyle w:val="ListParagraph"/>
       </w:pPr>
       <w:r>
-        <w:t>•  A single-call baseline to show what the multi-agent design buys; fix the Judge's no-show fee reasoning on NS-002-C1 rather than only catching it; run the sealed set once before submission.</w:t>
-      </w:r>
-    </w:p>
-    <w:p>
-      <w:pPr>
-        <w:pStyle w:val="ListParagraph"/>
-      </w:pPr>
-      <w:r>
-        <w:t>•  Try lower reasoning effort for the advocates (switch already in place) if accuracy holds.</w:t>
-      </w:r>
-    </w:p>
-    <w:p>
-      <w:pPr>
-        <w:pStyle w:val="ListParagraph"/>
-      </w:pPr>
-      <w:r>
-        <w:t>•  Deploy on Tencent Lighthouse with Docker and Postgres for the rulings store.</w:t>
+        <w:t xml:space="preserve">•  Fraud hard signals: a driver pressing "arrived" while GPS is far from the pickup (the NS-002-C1 pattern), and a claim that contradicts GPS or app events.</w:t>
+      </w:r>
+    </w:p>
+    <w:p>
+      <w:pPr>
+        <w:pStyle w:val="ListParagraph"/>
+      </w:pPr>
+      <w:r>
+        <w:t xml:space="preserve">•  Policy as code for fee rules (wait thresholds, free-cancellation windows, delay waivers), so the Judge cannot misread a number.</w:t>
+      </w:r>
+    </w:p>
+    <w:p>
+      <w:pPr>
+        <w:pStyle w:val="ListParagraph"/>
+      </w:pPr>
+      <w:r>
+        <w:t xml:space="preserve">•  Deploy on the Tencent Lighthouse server (Singapore) with Docker and Postgres for the rulings store.</w:t>
       </w:r>
     </w:p>
     <w:p>
@@ -6342,7 +7736,7 @@
         <w:pStyle w:val="ListParagraph"/>
       </w:pPr>
       <w:r>
-        <w:t>•  Let the Policy agent query the Tencent ADP assistant, and build the fraud and bad-faith agent on the new history store (design in docs/09_FRAUD_AGENT_DESIGN.md).</w:t>
+        <w:t xml:space="preserve">•  An independent auditor on a different model (e.g. Hunyuan via Tencent ADP) for errors the same model cannot see; Judge majority vote only on low-confidence cases; measure run-to-run variance of the baseline.</w:t>
       </w:r>
     </w:p>
     <w:p>
@@ -6359,7 +7753,7 @@
         <w:rPr>
           <w:i w:val="0"/>
         </w:rPr>
-        <w:t>The biggest change over these two weeks was in how we worked, not in what we built. In the first week we added agents and judged them by eye; in the second we measured every change, kept what improved the numbers and dropped what did not — including ideas we liked. The system that remains is smaller than our plans were, but every part of it has a measured reason to be there, and it hands a case to a person whenever it cannot back its own ruling.</w:t>
+        <w:t xml:space="preserve">The biggest change over these three weeks was in how we worked, not in what we built. In the first week we added agents and judged them by eye; in the second we measured every change, kept what improved the numbers and dropped what did not. In the third we built a more autonomous architecture we liked, measured it on the full set three times, and kept only the two parts that earned their place. The system that remains is smaller than our plans were, but every part of it has a measured reason to be there, and it hands a case to a person whenever it cannot back its own ruling.</w:t>
       </w:r>
     </w:p>
     <w:sectPr>

</xml_diff>

<commit_message>
docs: README, figure, journal and submission draft with the fresh-set and sealed-set results
</commit_message>
<xml_diff>
--- a/docs/Development_Journal.docx
+++ b/docs/Development_Journal.docx
@@ -2385,6 +2385,265 @@
           <w:b/>
         </w:rPr>
         <w:t xml:space="preserve">Result: 35/38 (92.1%), every miss sent to a person; on the 37 cases shared with D20, 34/37 against 35/37 at +6% tokens (run 20261009-164028).</w:t>
+      </w:r>
+    </w:p>
+    <w:p>
+      <w:pPr>
+        <w:pStyle w:val="Heading3"/>
+      </w:pPr>
+      <w:r>
+        <w:rPr/>
+        <w:t>Day 18 — Wrong payouts first: scope texts, discretion, code Judge</w:t>
+      </w:r>
+    </w:p>
+    <w:p>
+      <w:pPr/>
+      <w:r>
+        <w:rPr/>
+        <w:t>Date: 11/10/2026</w:t>
+      </w:r>
+    </w:p>
+    <w:p>
+      <w:pPr/>
+      <w:r>
+        <w:rPr/>
+        <w:t>Objective: Stop the system from paying out on a wrong ruling, before raising the score.</w:t>
+      </w:r>
+    </w:p>
+    <w:p>
+      <w:pPr/>
+      <w:r>
+        <w:rPr/>
+        <w:t>Work completed:</w:t>
+      </w:r>
+    </w:p>
+    <w:p>
+      <w:pPr>
+        <w:pStyle w:val="ListParagraph"/>
+      </w:pPr>
+      <w:r>
+        <w:rPr/>
+        <w:t>•  (billy) Objection round tested on a full run and left off: it flipped a correct RD-002 ruling (D34).</w:t>
+      </w:r>
+    </w:p>
+    <w:p>
+      <w:pPr>
+        <w:pStyle w:val="ListParagraph"/>
+      </w:pPr>
+      <w:r>
+        <w:rPr/>
+        <w:t>•  (billy, with CodeBuddy) Every case rule now carries a scope text that says what it governs, never the answer (D36); a rule-applicability checker was tried first and rejected on replay (D35).</w:t>
+      </w:r>
+    </w:p>
+    <w:p>
+      <w:pPr>
+        <w:pStyle w:val="ListParagraph"/>
+      </w:pPr>
+      <w:r>
+        <w:rPr/>
+        <w:t>•  (billy) Fairness sends a partial refund that only Ryde's discretion could set to a person (D37). A Claude Sonnet subagent wrote 20 test cases for this trap without seeing the code (DS-01..DS-20).</w:t>
+      </w:r>
+    </w:p>
+    <w:p>
+      <w:pPr>
+        <w:pStyle w:val="ListParagraph"/>
+      </w:pPr>
+      <w:r>
+        <w:rPr/>
+        <w:t>•  (billy, with CodeBuddy) Code Judge (D38): the Judge names the facts its ruling turns on, each with its record; code checks that each is verified and that any refund is plain arithmetic on record figures. A draft that fails goes back to the Judge once, then to a person.</w:t>
+      </w:r>
+    </w:p>
+    <w:p>
+      <w:pPr/>
+      <w:r>
+        <w:rPr/>
+        <w:t>Problems encountered:</w:t>
+      </w:r>
+    </w:p>
+    <w:p>
+      <w:pPr>
+        <w:pStyle w:val="ListParagraph"/>
+      </w:pPr>
+      <w:r>
+        <w:rPr/>
+        <w:t>•  The D36 run scored 34/38 but paid one wrong refund (RD-002, split "at discretion").</w:t>
+      </w:r>
+    </w:p>
+    <w:p>
+      <w:pPr>
+        <w:pStyle w:val="ListParagraph"/>
+      </w:pPr>
+      <w:r>
+        <w:rPr/>
+        <w:t>•  On the new discretion set the system scored 10/21 and paid out on wrong rulings (DS-09 read a time window backwards).</w:t>
+      </w:r>
+    </w:p>
+    <w:p>
+      <w:pPr/>
+      <w:r>
+        <w:rPr/>
+        <w:t>What we did about it:</w:t>
+      </w:r>
+    </w:p>
+    <w:p>
+      <w:pPr>
+        <w:pStyle w:val="ListParagraph"/>
+      </w:pPr>
+      <w:r>
+        <w:rPr/>
+        <w:t>•  Code Judge A/B on 13 targeted cases: wrong payouts fell from 4 to 1.</w:t>
+      </w:r>
+    </w:p>
+    <w:p>
+      <w:pPr>
+        <w:pStyle w:val="Heading3"/>
+      </w:pPr>
+      <w:r>
+        <w:rPr/>
+        <w:t>Day 19 — Rule checks, a fresh blind set and the sealed set</w:t>
+      </w:r>
+    </w:p>
+    <w:p>
+      <w:pPr/>
+      <w:r>
+        <w:rPr/>
+        <w:t>Date: 12/10/2026</w:t>
+      </w:r>
+    </w:p>
+    <w:p>
+      <w:pPr/>
+      <w:r>
+        <w:rPr/>
+        <w:t>Objective: Close the last wrong payout and measure on cases nobody has tuned against.</w:t>
+      </w:r>
+    </w:p>
+    <w:p>
+      <w:pPr/>
+      <w:r>
+        <w:rPr/>
+        <w:t>Work completed:</w:t>
+      </w:r>
+    </w:p>
+    <w:p>
+      <w:pPr>
+        <w:pStyle w:val="ListParagraph"/>
+      </w:pPr>
+      <w:r>
+        <w:rPr/>
+        <w:t>•  (billy) Full 38-case regression with the code Judge: 33/38, 0 wrong payouts (D36: 34/38, 1 wrong payout).</w:t>
+      </w:r>
+    </w:p>
+    <w:p>
+      <w:pPr>
+        <w:pStyle w:val="ListParagraph"/>
+      </w:pPr>
+      <w:r>
+        <w:rPr/>
+        <w:t>•  (billy, with CodeBuddy) A conflict now names only the record it calls into question, so a correct arrival record is not blocked by a wrong no-show label (NS-001).</w:t>
+      </w:r>
+    </w:p>
+    <w:p>
+      <w:pPr>
+        <w:pStyle w:val="ListParagraph"/>
+      </w:pPr>
+      <w:r>
+        <w:rPr/>
+        <w:t>•  (billy, with CodeBuddy) Rule checks (D39): code measures the trip's time rules from the records and reports MET or NOT MET, so the Judge no longer does time arithmetic.</w:t>
+      </w:r>
+    </w:p>
+    <w:p>
+      <w:pPr>
+        <w:pStyle w:val="ListParagraph"/>
+      </w:pPr>
+      <w:r>
+        <w:rPr/>
+        <w:t>•  (billy) Absence rule: something missing from a platform record counts as verified; something missing from the chat does not, because people also talk by phone. A replay of 126 saved drafts showed the chat version would have paid a wrong amount on SQ-002, so the chat was excluded.</w:t>
+      </w:r>
+    </w:p>
+    <w:p>
+      <w:pPr>
+        <w:pStyle w:val="ListParagraph"/>
+      </w:pPr>
+      <w:r>
+        <w:rPr/>
+        <w:t>•  (billy) A Sonnet subagent wrote a fresh blind set (FS-01..FS-20): 16/20, 0 wrong payouts (D40).</w:t>
+      </w:r>
+    </w:p>
+    <w:p>
+      <w:pPr>
+        <w:pStyle w:val="ListParagraph"/>
+      </w:pPr>
+      <w:r>
+        <w:rPr/>
+        <w:t>•  (billy) Sealed set, run once: 16/23 correct (14/23 on the first pass; two runs hit provider errors and were re-run once), with one wrong payout: on SA-08 the Judge dropped the record the code Judge had blocked and the remanded draft passed (D41). Not fixed, so the sealed number stays clean.</w:t>
+      </w:r>
+    </w:p>
+    <w:p>
+      <w:pPr/>
+      <w:r>
+        <w:rPr/>
+        <w:t>Problems encountered:</w:t>
+      </w:r>
+    </w:p>
+    <w:p>
+      <w:pPr>
+        <w:pStyle w:val="ListParagraph"/>
+      </w:pPr>
+      <w:r>
+        <w:rPr/>
+        <w:t>•  FS-19, a sexual-harassment report, was closed by the system: the filer wrote "felt unsafe", and no safety keyword matched.</w:t>
+      </w:r>
+    </w:p>
+    <w:p>
+      <w:pPr>
+        <w:pStyle w:val="ListParagraph"/>
+      </w:pPr>
+      <w:r>
+        <w:rPr/>
+        <w:t>•  FS-10 was dismissed against the driver because a help-centre clause added a step the trip's own rule does not have.</w:t>
+      </w:r>
+    </w:p>
+    <w:p>
+      <w:pPr>
+        <w:pStyle w:val="ListParagraph"/>
+      </w:pPr>
+      <w:r>
+        <w:rPr/>
+        <w:t>•  Some correct rulings still go to a person because the Judge lists the record it is correcting as a decisive fact.</w:t>
+      </w:r>
+    </w:p>
+    <w:p>
+      <w:pPr/>
+      <w:r>
+        <w:rPr/>
+        <w:t>What we did about it:</w:t>
+      </w:r>
+    </w:p>
+    <w:p>
+      <w:pPr>
+        <w:pStyle w:val="ListParagraph"/>
+      </w:pPr>
+      <w:r>
+        <w:rPr/>
+        <w:t>•  Added harassment and personal-safety words to the P0 scan; scanned every case first: only FS-19 changed.</w:t>
+      </w:r>
+    </w:p>
+    <w:p>
+      <w:pPr>
+        <w:pStyle w:val="ListParagraph"/>
+      </w:pPr>
+      <w:r>
+        <w:rPr/>
+        <w:t>•  The Judge prompt now says the trip's own rules come first; checked on 8 guard cases, 0 wrong payouts.</w:t>
+      </w:r>
+    </w:p>
+    <w:p>
+      <w:pPr>
+        <w:pStyle w:val="ListParagraph"/>
+      </w:pPr>
+      <w:r>
+        <w:rPr/>
+        <w:t>•  A prompt line for the corrected-record pattern was tried live, did not change the Judge's output, and was removed. Left as is: it only sends cases to a person.</w:t>
       </w:r>
     </w:p>
     <w:p>
@@ -4311,6 +4570,70 @@
     </w:p>
     <w:p>
       <w:pPr>
+        <w:pStyle w:val="Heading3"/>
+      </w:pPr>
+      <w:r>
+        <w:rPr/>
+        <w:t>Iteration 18 — Scope texts and the discretion trap (11/10)</w:t>
+      </w:r>
+    </w:p>
+    <w:p>
+      <w:pPr/>
+      <w:r>
+        <w:rPr/>
+        <w:t>Rules in the case data had a value but no text, so the Judge guessed what each one governed. Each rule now carries a scope text. The Judge also used a general "refund at Ryde's discretion" clause to split charges the rules allowed; such a refund now goes to a person, since only Ryde can set it.</w:t>
+      </w:r>
+    </w:p>
+    <w:p>
+      <w:pPr>
+        <w:pStyle w:val="Heading3"/>
+      </w:pPr>
+      <w:r>
+        <w:rPr/>
+        <w:t>Iteration 19 — Code Judge (11–12/10)</w:t>
+      </w:r>
+    </w:p>
+    <w:p>
+      <w:pPr/>
+      <w:r>
+        <w:rPr/>
+        <w:t>We stopped asking the model to check itself. The Judge must list the facts its ruling turns on, with their records, and show the refund arithmetic; code checks both. On the 38-case set the score stayed at 33–34, but wrong payouts went from 1 to 0 there and on the fresh set. The sealed set found one: after a remand the Judge dropped the record that had blocked it (Failure 11).</w:t>
+      </w:r>
+    </w:p>
+    <w:p>
+      <w:pPr>
+        <w:pStyle w:val="Heading3"/>
+      </w:pPr>
+      <w:r>
+        <w:rPr/>
+        <w:t>Iteration 20 — Rule checks and the absence rule (12/10)</w:t>
+      </w:r>
+    </w:p>
+    <w:p>
+      <w:pPr/>
+      <w:r>
+        <w:rPr/>
+        <w:t>Time rules (no-show wait, free cancellation window, driver delay) are now measured in code and given to the Judge as MET or NOT MET. An absence in a platform record is verified, an absence in the chat is not; this choice came from a replay of saved drafts, not from a single case.</w:t>
+      </w:r>
+    </w:p>
+    <w:p>
+      <w:pPr>
+        <w:pStyle w:val="Heading3"/>
+      </w:pPr>
+      <w:r>
+        <w:rPr/>
+        <w:t>Iteration 21 — A fresh blind test set (12/10)</w:t>
+      </w:r>
+    </w:p>
+    <w:p>
+      <w:pPr/>
+      <w:r>
+        <w:rPr/>
+        <w:t>Every earlier set had been looked at while fixing. A Sonnet subagent wrote 20 new cases from a brief, without the code: 16/20, 0 wrong payouts. The misses gave two general fixes (safety words, the trip's own rules first), each checked on guard cases before it was kept.</w:t>
+      </w:r>
+    </w:p>
+    <w:p>
+      <w:pPr>
         <w:pStyle w:val="Heading2"/>
       </w:pPr>
       <w:r>
@@ -5631,6 +5954,54 @@
           <w:i w:val="0"/>
         </w:rPr>
         <w:t xml:space="preserve">Advocate research, numbered pools, typed moves and a structured Judge each made sense on single cases, and the architecture was easier to audit. Three full runs scored 31–32/37 against the baseline's 35/37, at 42–47% more tokens. We kept the baseline and took over only triage and the Safety tiers. Lesson: judge an architecture on the full set against a fixed rollback rule, not on the cases that inspired it.</w:t>
+      </w:r>
+    </w:p>
+    <w:p>
+      <w:pPr>
+        <w:pStyle w:val="Heading3"/>
+      </w:pPr>
+      <w:r>
+        <w:rPr/>
+        <w:t>Failure 9 — A harassment report closed by the system (12/10)</w:t>
+      </w:r>
+    </w:p>
+    <w:p>
+      <w:pPr/>
+      <w:r>
+        <w:rPr/>
+        <w:t>The safety scan looked for words such as "harassment". FS-19's filer described the harassment and said she felt unsafe, without that word, and the ticket type was service quality, so no safety path ran. No money moved, but a safety report must always reach a person. The scan now includes harassment and personal-safety words; only FS-19 changed across all cases.</w:t>
+      </w:r>
+    </w:p>
+    <w:p>
+      <w:pPr>
+        <w:pStyle w:val="Heading3"/>
+      </w:pPr>
+      <w:r>
+        <w:rPr/>
+        <w:t>Failure 10 — An instruction the Judge did not follow (12/10)</w:t>
+      </w:r>
+    </w:p>
+    <w:p>
+      <w:pPr/>
+      <w:r>
+        <w:rPr/>
+        <w:t>We added one sentence telling the Judge not to list the record it corrects as a decisive fact. Live, it listed the record anyway, and NS-001 went to a person in every run. We removed the line and recorded it as a rejected attempt: a general instruction does not change this behaviour.</w:t>
+      </w:r>
+    </w:p>
+    <w:p>
+      <w:pPr>
+        <w:pStyle w:val="Heading3"/>
+      </w:pPr>
+      <w:r>
+        <w:rPr/>
+        <w:t>Failure 11 — A remand that let a wrong payout through (12/10)</w:t>
+      </w:r>
+    </w:p>
+    <w:p>
+      <w:pPr/>
+      <w:r>
+        <w:rPr/>
+        <w:t>On sealed case SA-08 the code Judge blocked the first draft because it rested on an arrival record that a GPS gap called into question. On remand the Judge removed that record from its decisive facts, the draft passed, and S$8.00 was refunded where a person should have decided. We found it in the sealed run and did not fix it there, so the sealed number stays clean; the fix is to keep a conflict on the ruling's topic in force after a remand.</w:t>
       </w:r>
     </w:p>
     <w:p>

</xml_diff>

<commit_message>
docs: business value section, live site, deployment faults (D44), journal day 20
</commit_message>
<xml_diff>
--- a/docs/Development_Journal.docx
+++ b/docs/Development_Journal.docx
@@ -2644,6 +2644,140 @@
       <w:r>
         <w:rPr/>
         <w:t>•  A prompt line for the corrected-record pattern was tried live, did not change the Judge's output, and was removed. Left as is: it only sends cases to a person.</w:t>
+      </w:r>
+    </w:p>
+    <w:p>
+      <w:pPr>
+        <w:pStyle w:val="Heading3"/>
+      </w:pPr>
+      <w:r>
+        <w:rPr/>
+        <w:t>Day 20 — Closing the remand loophole, a second blind set, going live</w:t>
+      </w:r>
+    </w:p>
+    <w:p>
+      <w:pPr/>
+      <w:r>
+        <w:rPr/>
+        <w:t>Date: 12–13/10/2026</w:t>
+      </w:r>
+    </w:p>
+    <w:p>
+      <w:pPr/>
+      <w:r>
+        <w:rPr/>
+        <w:t>Objective: Fix the wrong payout the sealed set found, test the fix on cases nobody had seen, and put the system online.</w:t>
+      </w:r>
+    </w:p>
+    <w:p>
+      <w:pPr/>
+      <w:r>
+        <w:rPr/>
+        <w:t>Work completed:</w:t>
+      </w:r>
+    </w:p>
+    <w:p>
+      <w:pPr>
+        <w:pStyle w:val="ListParagraph"/>
+      </w:pPr>
+      <w:r>
+        <w:rPr/>
+        <w:t>•  (billy, with CodeBuddy) Code Judge rule D42: a second draft that pays the same as the blocked draft but no longer lists the record that blocked it goes to a person. A replay of 135 saved runs changed only SA-08.</w:t>
+      </w:r>
+    </w:p>
+    <w:p>
+      <w:pPr>
+        <w:pStyle w:val="ListParagraph"/>
+      </w:pPr>
+      <w:r>
+        <w:rPr/>
+        <w:t>•  (billy) New rule for the team: every change is tested on a new blind set written for it. A Sonnet subagent wrote F2-01..F2-20 without the code: 13/20, one wrong payout (F2-01, a rule's wording misread). The new rule stopped a S$5.00 payout live on F2-17.</w:t>
+      </w:r>
+    </w:p>
+    <w:p>
+      <w:pPr>
+        <w:pStyle w:val="ListParagraph"/>
+      </w:pPr>
+      <w:r>
+        <w:rPr/>
+        <w:t>•  (billy) Precedent design (D43): code, not the Judge's own confidence, decides when precedents are shown; the first version shows them to the human reviewer only.</w:t>
+      </w:r>
+    </w:p>
+    <w:p>
+      <w:pPr>
+        <w:pStyle w:val="ListParagraph"/>
+      </w:pPr>
+      <w:r>
+        <w:rPr/>
+        <w:t>•  (billy) Site live on the Tencent Lighthouse server in Singapore (systemd + Caddy), behind an access code; three recorded runs loaded for the demo; demo script written (docs/DEMO_SCRIPT.md).</w:t>
+      </w:r>
+    </w:p>
+    <w:p>
+      <w:pPr/>
+      <w:r>
+        <w:rPr/>
+        <w:t>Problems encountered:</w:t>
+      </w:r>
+    </w:p>
+    <w:p>
+      <w:pPr>
+        <w:pStyle w:val="ListParagraph"/>
+      </w:pPr>
+      <w:r>
+        <w:rPr/>
+        <w:t>•  The site stayed on 401 after a correct access code.</w:t>
+      </w:r>
+    </w:p>
+    <w:p>
+      <w:pPr>
+        <w:pStyle w:val="ListParagraph"/>
+      </w:pPr>
+      <w:r>
+        <w:rPr/>
+        <w:t>•  Every live run failed with "'safety' is already being used as a state key".</w:t>
+      </w:r>
+    </w:p>
+    <w:p>
+      <w:pPr>
+        <w:pStyle w:val="ListParagraph"/>
+      </w:pPr>
+      <w:r>
+        <w:rPr/>
+        <w:t>•  Then every LLM call failed with HTTP 402.</w:t>
+      </w:r>
+    </w:p>
+    <w:p>
+      <w:pPr/>
+      <w:r>
+        <w:rPr/>
+        <w:t>What we did about it:</w:t>
+      </w:r>
+    </w:p>
+    <w:p>
+      <w:pPr>
+        <w:pStyle w:val="ListParagraph"/>
+      </w:pPr>
+      <w:r>
+        <w:rPr/>
+        <w:t>•  401: a page-load request answered late and cleared the code; the page now clears the code only when the server refused that code (test added).</w:t>
+      </w:r>
+    </w:p>
+    <w:p>
+      <w:pPr>
+        <w:pStyle w:val="ListParagraph"/>
+      </w:pPr>
+      <w:r>
+        <w:rPr/>
+        <w:t>•  State key: the server installed the old pins in requirements.txt (LangGraph 0.3.0); the pins now match the versions the tests run on.</w:t>
+      </w:r>
+    </w:p>
+    <w:p>
+      <w:pPr>
+        <w:pStyle w:val="ListParagraph"/>
+      </w:pPr>
+      <w:r>
+        <w:rPr/>
+        <w:t>•  402: the server's Cerebras key had run out of credit; it was swapped for a working key.</w:t>
       </w:r>
     </w:p>
     <w:p>
@@ -4634,6 +4768,22 @@
     </w:p>
     <w:p>
       <w:pPr>
+        <w:pStyle w:val="Heading3"/>
+      </w:pPr>
+      <w:r>
+        <w:rPr/>
+        <w:t>Iteration 22 — A fix found on the sealed set, tested on a new set (12/10)</w:t>
+      </w:r>
+    </w:p>
+    <w:p>
+      <w:pPr/>
+      <w:r>
+        <w:rPr/>
+        <w:t>The sealed set showed that a remand let the Judge delete the record that had blocked its draft and pass. We closed it in code, chose the narrow rule after a replay showed the broader one would also have stopped 4 correct rulings, and kept the sealed result as the number for the code before the fix. Because every older set had been looked at, the fix was tested on 20 new blind cases.</w:t>
+      </w:r>
+    </w:p>
+    <w:p>
+      <w:pPr>
         <w:pStyle w:val="Heading2"/>
       </w:pPr>
       <w:r>
@@ -6002,6 +6152,22 @@
       <w:r>
         <w:rPr/>
         <w:t>On sealed case SA-08 the code Judge blocked the first draft because it rested on an arrival record that a GPS gap called into question. On remand the Judge removed that record from its decisive facts, the draft passed, and S$8.00 was refunded where a person should have decided. We found it in the sealed run and did not fix it there, so the sealed number stays clean; the fix is to keep a conflict on the ruling's topic in force after a remand.</w:t>
+      </w:r>
+    </w:p>
+    <w:p>
+      <w:pPr>
+        <w:pStyle w:val="Heading3"/>
+      </w:pPr>
+      <w:r>
+        <w:rPr/>
+        <w:t>Failure 12 — Works on the laptop, fails on the server (13/10)</w:t>
+      </w:r>
+    </w:p>
+    <w:p>
+      <w:pPr/>
+      <w:r>
+        <w:rPr/>
+        <w:t>Three faults showed up only after deployment: a race in the page's access-code handling, dependency pins far older than the versions the tests ran on, and a provider key with no credit. None was visible in the 507 tests or the evaluation runs, because those ran on the laptop's packages and keys. The pins now match the tested versions, and the deployment notes list the checks to run after each update.</w:t>
       </w:r>
     </w:p>
     <w:p>

</xml_diff>

<commit_message>
docs: architecture figure, README, demo script and narration, submission draft and journal for D45-D49
</commit_message>
<xml_diff>
--- a/docs/Development_Journal.docx
+++ b/docs/Development_Journal.docx
@@ -2778,6 +2778,149 @@
       <w:r>
         <w:rPr/>
         <w:t>•  402: the server's Cerebras key had run out of credit; it was swapped for a working key.</w:t>
+      </w:r>
+    </w:p>
+    <w:p>
+      <w:pPr>
+        <w:pStyle w:val="Heading3"/>
+      </w:pPr>
+      <w:r>
+        <w:rPr/>
+        <w:t>Day 21 — Precedents tested, photo evidence, two wording fixes and a case editor</w:t>
+      </w:r>
+    </w:p>
+    <w:p>
+      <w:pPr/>
+      <w:r>
+        <w:rPr/>
+        <w:t>Date: 13–14/10/2026</w:t>
+      </w:r>
+    </w:p>
+    <w:p>
+      <w:pPr/>
+      <w:r>
+        <w:rPr/>
+        <w:t>Objective: Test the precedent loop end to end, add photo evidence, close the gaps that new blind sets found, and let anyone build a case in the dashboard.</w:t>
+      </w:r>
+    </w:p>
+    <w:p>
+      <w:pPr/>
+      <w:r>
+        <w:rPr/>
+        <w:t>Work completed:</w:t>
+      </w:r>
+    </w:p>
+    <w:p>
+      <w:pPr>
+        <w:pStyle w:val="ListParagraph"/>
+      </w:pPr>
+      <w:r>
+        <w:rPr/>
+        <w:t>•  (billy) Precedent loop tested on blind sets (D45): 11/16 with and without precedents. The Judge never followed a precedent, so none were released.</w:t>
+      </w:r>
+    </w:p>
+    <w:p>
+      <w:pPr>
+        <w:pStyle w:val="ListParagraph"/>
+      </w:pPr>
+      <w:r>
+        <w:rPr/>
+        <w:t>•  (billy) Photo evidence (D46): code reads each photo's capture time and GPS against the trip, any editing-software tag, and whether the same file is in another case; a vision model (qwen on Groq) says what the photo shows and can only raise doubts. Blind photo set: 8/12.</w:t>
+      </w:r>
+    </w:p>
+    <w:p>
+      <w:pPr>
+        <w:pStyle w:val="ListParagraph"/>
+      </w:pPr>
+      <w:r>
+        <w:rPr/>
+        <w:t>•  (billy) A doubted photo goes to a person whichever side the ruling favours (D47). New blind photo set: 9/10, no fee confirmed or removed on a doubted photo.</w:t>
+      </w:r>
+    </w:p>
+    <w:p>
+      <w:pPr>
+        <w:pStyle w:val="ListParagraph"/>
+      </w:pPr>
+      <w:r>
+        <w:rPr/>
+        <w:t>•  (billy) Cancellation-fee wording rewritten to match Ryde's official help page (D48): the three cases that misread it are now right; a new blind set scored 7/10.</w:t>
+      </w:r>
+    </w:p>
+    <w:p>
+      <w:pPr>
+        <w:pStyle w:val="ListParagraph"/>
+      </w:pPr>
+      <w:r>
+        <w:rPr/>
+        <w:t>•  (billy) Case editor (D49): build a case, or copy one and change it, with chat, app events, GPS, rules and photos (with the capture time and place to write into each), then run it. Deployed.</w:t>
+      </w:r>
+    </w:p>
+    <w:p>
+      <w:pPr/>
+      <w:r>
+        <w:rPr/>
+        <w:t>Problems encountered:</w:t>
+      </w:r>
+    </w:p>
+    <w:p>
+      <w:pPr>
+        <w:pStyle w:val="ListParagraph"/>
+      </w:pPr>
+      <w:r>
+        <w:rPr/>
+        <w:t>•  On the first photo set the Judge refunded a S$100 cleaning fee automatically because the driver's photo was taken before the trip; the answer key said a person must decide.</w:t>
+      </w:r>
+    </w:p>
+    <w:p>
+      <w:pPr>
+        <w:pStyle w:val="ListParagraph"/>
+      </w:pPr>
+      <w:r>
+        <w:rPr/>
+        <w:t>•  Our own rule text, "not cancellations caused by the driver", was read as "not cancellations the driver pressed", while a driver always presses cancel on a no-show.</w:t>
+      </w:r>
+    </w:p>
+    <w:p>
+      <w:pPr>
+        <w:pStyle w:val="ListParagraph"/>
+      </w:pPr>
+      <w:r>
+        <w:rPr/>
+        <w:t>•  One miss on a new blind set was the brief's fault: we had left half of a rule out.</w:t>
+      </w:r>
+    </w:p>
+    <w:p>
+      <w:pPr/>
+      <w:r>
+        <w:rPr/>
+        <w:t>What we did about it:</w:t>
+      </w:r>
+    </w:p>
+    <w:p>
+      <w:pPr>
+        <w:pStyle w:val="ListParagraph"/>
+      </w:pPr>
+      <w:r>
+        <w:rPr/>
+        <w:t>•  Code now sends any case with a doubted photo to a person (D47); the next blind set showed none slipped through.</w:t>
+      </w:r>
+    </w:p>
+    <w:p>
+      <w:pPr>
+        <w:pStyle w:val="ListParagraph"/>
+      </w:pPr>
+      <w:r>
+        <w:rPr/>
+        <w:t>•  The rule text now names the driver-pressed no-show cancel explicitly (D48).</w:t>
+      </w:r>
+    </w:p>
+    <w:p>
+      <w:pPr>
+        <w:pStyle w:val="ListParagraph"/>
+      </w:pPr>
+      <w:r>
+        <w:rPr/>
+        <w:t>•  The brief error was recorded as an answer-key error, not "fixed" by loosening a check.</w:t>
       </w:r>
     </w:p>
     <w:p>
@@ -4784,6 +4927,70 @@
     </w:p>
     <w:p>
       <w:pPr>
+        <w:pStyle w:val="Heading3"/>
+      </w:pPr>
+      <w:r>
+        <w:rPr/>
+        <w:t>Iteration 23 — Precedents tested, not released (13–14/10)</w:t>
+      </w:r>
+    </w:p>
+    <w:p>
+      <w:pPr/>
+      <w:r>
+        <w:rPr/>
+        <w:t>We tested the learning loop with a simulated reviewer on ten training cases and sixteen new ones. Accuracy was 11/16 with and without precedents, and the Judge never cited one, so a precedent in the prompt does not fix a rule the model keeps misreading. None were released (D45).</w:t>
+      </w:r>
+    </w:p>
+    <w:p>
+      <w:pPr>
+        <w:pStyle w:val="Heading3"/>
+      </w:pPr>
+      <w:r>
+        <w:rPr/>
+        <w:t>Iteration 24 — Photo evidence (14/10)</w:t>
+      </w:r>
+    </w:p>
+    <w:p>
+      <w:pPr/>
+      <w:r>
+        <w:rPr/>
+        <w:t>Photos are checked twice. Code reads what the file says: capture time against the trip, GPS against the drop-off, editing software, and the same file in another case. A vision model reads what it shows. Only code findings count as facts; the model's view can only raise a doubt. A blind set of twelve cleaning-fee cases with stamped photos scored 8/12 (D46).</w:t>
+      </w:r>
+    </w:p>
+    <w:p>
+      <w:pPr>
+        <w:pStyle w:val="Heading3"/>
+      </w:pPr>
+      <w:r>
+        <w:rPr/>
+        <w:t>Iteration 25 — Doubted photos and the fee wording (14/10)</w:t>
+      </w:r>
+    </w:p>
+    <w:p>
+      <w:pPr/>
+      <w:r>
+        <w:rPr/>
+        <w:t>The code Judge blocked rulings that rested on a doubted record, but not a refund that rested on the doubt itself. Any doubted photo now sends the case to a person (D47): a new blind set scored 9/10 and caught two refunds the Judge had drafted. Rewriting one sentence of our rule text fixed the three cases that misread the cancellation fee; a blind set for it scored 7/10 and found two new wrong payouts on other points, which we publish (D48).</w:t>
+      </w:r>
+    </w:p>
+    <w:p>
+      <w:pPr>
+        <w:pStyle w:val="Heading3"/>
+      </w:pPr>
+      <w:r>
+        <w:rPr/>
+        <w:t>Iteration 26 — A case editor (14/10)</w:t>
+      </w:r>
+    </w:p>
+    <w:p>
+      <w:pPr/>
+      <w:r>
+        <w:rPr/>
+        <w:t>The dashboard can now build a case, or copy one and change it: complaint, trip, both profiles, both sides' chat, app events, GPS, rules and photos. The server keeps only known fields, assigns the ids and writes each photo again with the time and place chosen, so a judge can show a genuine or a doubtful photo and watch the agents handle it (D49).</w:t>
+      </w:r>
+    </w:p>
+    <w:p>
+      <w:pPr>
         <w:pStyle w:val="Heading2"/>
       </w:pPr>
       <w:r>
@@ -6172,6 +6379,38 @@
     </w:p>
     <w:p>
       <w:pPr>
+        <w:pStyle w:val="Heading3"/>
+      </w:pPr>
+      <w:r>
+        <w:rPr/>
+        <w:t>Failure 13 — A refund on a doubtful photo (14/10)</w:t>
+      </w:r>
+    </w:p>
+    <w:p>
+      <w:pPr/>
+      <w:r>
+        <w:rPr/>
+        <w:t>A rider disputed a S$100 cleaning fee. The driver's photo was taken 38 minutes before pickup. The Judge removed the fee automatically: a defensible reading, but the case's rule said a doubted photo needs a person, and our code check let it through because the deciding fact ("taken before the trip") was itself a code finding. Fix: a doubted photo now always goes to a person (D47).</w:t>
+      </w:r>
+    </w:p>
+    <w:p>
+      <w:pPr>
+        <w:pStyle w:val="Heading3"/>
+      </w:pPr>
+      <w:r>
+        <w:rPr/>
+        <w:t>Failure 14 — Our own words misled the Judge (14/10)</w:t>
+      </w:r>
+    </w:p>
+    <w:p>
+      <w:pPr/>
+      <w:r>
+        <w:rPr/>
+        <w:t>Three wrong rulings, one of them a wrong payout, came from one sentence we wrote to describe a rule. Precedents did not fix it; rewriting the sentence did (D48). The new blind set then found two other wrong payouts: a held fee not released, and a driver's own admission in the chat set aside. Both are open and published.</w:t>
+      </w:r>
+    </w:p>
+    <w:p>
+      <w:pPr>
         <w:pStyle w:val="Heading2"/>
       </w:pPr>
       <w:r>
@@ -7497,6 +7736,15 @@
         <w:rPr>
           <w:i w:val="0"/>
         </w:rPr>
+        <w:t>Latest (12–14/10, Cerebras gpt-oss-120b, one run per case): 102 of 133 rulings correct across seven test sets. 38 dev and held-out cases 33/38 and a first fresh blind set 16/20, both with no wrong payout; a sealed set run once 16/23 and a second fresh set 13/20, one S$8.00 wrong payout each; photo sets 8/12 (one S$100 refund on a doubted photo, then fixed) and 9/10; a cancellation-scope set 7/10 with two wrong payouts (S$5.50, S$8.00). About 98 seconds per dispute and 82% of standard disputes closed with no human on the first four sets. The earlier results below are kept for the record.</w:t>
+      </w:r>
+    </w:p>
+    <w:p>
+      <w:pPr/>
+      <w:r>
+        <w:rPr>
+          <w:i w:val="0"/>
+        </w:rPr>
         <w:t xml:space="preserve">Latest complete full run on merged code (6/10, run 20261005-171730, 37 cases: 14 dev, 19 held-out, 4 fraud; Cerebras gpt-oss-120b, full debates). The adaptive-triage version (9/10, run 20261009-164028, 38 cases) scored verdict 35/38 (92.1%), refund 28/31, classification 100%, P0 1/1, missing-data escalation 5/5, citation validity 100%, Hit@3 97%, 0 failed runs, about 28.2k tokens and US$0.012 per case; all three misses went to a person.</w:t>
       </w:r>
     </w:p>
@@ -8249,7 +8497,7 @@
         <w:pStyle w:val="ListParagraph"/>
       </w:pPr>
       <w:r>
-        <w:t xml:space="preserve">•  Deploy on the Tencent Lighthouse server (Singapore) with Docker and Postgres for the rulings store.</w:t>
+        <w:t>•  Done 13/10: live on a Tencent Lighthouse server in Singapore (systemd + Caddy). Next: monitoring and a Docker image on the server.</w:t>
       </w:r>
     </w:p>
     <w:p>
@@ -8265,7 +8513,7 @@
         <w:pStyle w:val="ListParagraph"/>
       </w:pPr>
       <w:r>
-        <w:t>•  Image evidence (damage and cleaning claims) and more dispute types.</w:t>
+        <w:t>•  Photo evidence for cleaning claims is done (D46–D47); next: damage claims, a cleaning-fee dispute type, and the two open wrong payouts (a held fee in a driver's dispute, a party's own chat admission).</w:t>
       </w:r>
     </w:p>
     <w:p>

</xml_diff>

<commit_message>
docs: Policy v2.1 and the organisers' format in the architecture figure, README, demo script and narration, submission form, submission draft and journal
</commit_message>
<xml_diff>
--- a/docs/Development_Journal.docx
+++ b/docs/Development_Journal.docx
@@ -2921,6 +2921,149 @@
       <w:r>
         <w:rPr/>
         <w:t>•  The brief error was recorded as an answer-key error, not "fixed" by loosening a check.</w:t>
+      </w:r>
+    </w:p>
+    <w:p>
+      <w:pPr>
+        <w:pStyle w:val="Heading3"/>
+      </w:pPr>
+      <w:r>
+        <w:rPr/>
+        <w:t>Day 22 — The organisers' policy and sample format</w:t>
+      </w:r>
+    </w:p>
+    <w:p>
+      <w:pPr/>
+      <w:r>
+        <w:rPr/>
+        <w:t>Date: 14–15/10/2026</w:t>
+      </w:r>
+    </w:p>
+    <w:p>
+      <w:pPr/>
+      <w:r>
+        <w:rPr/>
+        <w:t>Objective: Rule under the organisers' Ryde Dispute Resolution Policy v2.1 and read their full sample format, then prove it on their samples, two new blind sets and a regression of earlier cases.</w:t>
+      </w:r>
+    </w:p>
+    <w:p>
+      <w:pPr/>
+      <w:r>
+        <w:rPr/>
+        <w:t>Work completed:</w:t>
+      </w:r>
+    </w:p>
+    <w:p>
+      <w:pPr>
+        <w:pStyle w:val="ListParagraph"/>
+      </w:pPr>
+      <w:r>
+        <w:rPr/>
+        <w:t>•  (billy) Sample format (D50): fare breakdown, surge log, recommended route and traffic incidents read as records; the samples' analysis sections removed so no agent sees a conclusion.</w:t>
+      </w:r>
+    </w:p>
+    <w:p>
+      <w:pPr>
+        <w:pStyle w:val="ListParagraph"/>
+      </w:pPr>
+      <w:r>
+        <w:rPr/>
+        <w:t>•  (billy) Code tools for v2.1: surge rose without notice (s3.3), excess over the recommended route (s1.3), incidents on that route (s1.4), a message and a call before a no-show cancel (s2.3).</w:t>
+      </w:r>
+    </w:p>
+    <w:p>
+      <w:pPr>
+        <w:pStyle w:val="ListParagraph"/>
+      </w:pPr>
+      <w:r>
+        <w:rPr/>
+        <w:t>•  (billy) v2.1 in every Case Brief, cited by section; its routing in code: safety (s5.2), value above S$50 (s6.1), fraud flags (s6.3), contested damage (s4.4).</w:t>
+      </w:r>
+    </w:p>
+    <w:p>
+      <w:pPr>
+        <w:pStyle w:val="ListParagraph"/>
+      </w:pPr>
+      <w:r>
+        <w:rPr/>
+        <w:t>•  (billy) 26 answer keys changed after free audits against v2.1 (routing and the s2.3 contact rule); the old rulings kept beside the new ones.</w:t>
+      </w:r>
+    </w:p>
+    <w:p>
+      <w:pPr>
+        <w:pStyle w:val="ListParagraph"/>
+      </w:pPr>
+      <w:r>
+        <w:rPr/>
+        <w:t>•  (billy) Results: the organisers' samples 3/3; blind sets 10/12 and 25/30; regression of 52 earlier cases 44/52 with no wrong payout. Deployed; a teammate's demo-reliability changes merged first.</w:t>
+      </w:r>
+    </w:p>
+    <w:p>
+      <w:pPr/>
+      <w:r>
+        <w:rPr/>
+        <w:t>Problems encountered:</w:t>
+      </w:r>
+    </w:p>
+    <w:p>
+      <w:pPr>
+        <w:pStyle w:val="ListParagraph"/>
+      </w:pPr>
+      <w:r>
+        <w:rPr/>
+        <w:t>•  The Judge escalated DISP-001 itself because v2.1 s6.2 says a deviation over 2 km escalates, while the organisers' own sample expects an automatic refund.</w:t>
+      </w:r>
+    </w:p>
+    <w:p>
+      <w:pPr>
+        <w:pStyle w:val="ListParagraph"/>
+      </w:pPr>
+      <w:r>
+        <w:rPr/>
+        <w:t>•  New blind sets found wrong payouts the code allowed: a route refund that included tolls and time, and an upheld claim that paid nothing.</w:t>
+      </w:r>
+    </w:p>
+    <w:p>
+      <w:pPr>
+        <w:pStyle w:val="ListParagraph"/>
+      </w:pPr>
+      <w:r>
+        <w:rPr/>
+        <w:t>•  The laptop ran out of memory twice during long runs, and four Cerebras keys hit their daily limit.</w:t>
+      </w:r>
+    </w:p>
+    <w:p>
+      <w:pPr/>
+      <w:r>
+        <w:rPr/>
+        <w:t>What we did about it:</w:t>
+      </w:r>
+    </w:p>
+    <w:p>
+      <w:pPr>
+        <w:pStyle w:val="ListParagraph"/>
+      </w:pPr>
+      <w:r>
+        <w:rPr/>
+        <w:t>•  Routing stays in code; the 2 km row is shown with a note and not applied (the sample wins).</w:t>
+      </w:r>
+    </w:p>
+    <w:p>
+      <w:pPr>
+        <w:pStyle w:val="ListParagraph"/>
+      </w:pPr>
+      <w:r>
+        <w:rPr/>
+        <w:t>•  Two code checks: a route refund is capped at the excess distance fare; an upheld driver claim must state its award. Both cases passed on re-run.</w:t>
+      </w:r>
+    </w:p>
+    <w:p>
+      <w:pPr>
+        <w:pStyle w:val="ListParagraph"/>
+      </w:pPr>
+      <w:r>
+        <w:rPr/>
+        <w:t>•  Runs moved to short foreground batches that resume where they stopped, starting from unused keys.</w:t>
       </w:r>
     </w:p>
     <w:p>
@@ -4991,6 +5134,38 @@
     </w:p>
     <w:p>
       <w:pPr>
+        <w:pStyle w:val="Heading3"/>
+      </w:pPr>
+      <w:r>
+        <w:rPr/>
+        <w:t>Iteration 27 — The organisers' policy (14–15/10)</w:t>
+      </w:r>
+    </w:p>
+    <w:p>
+      <w:pPr/>
+      <w:r>
+        <w:rPr/>
+        <w:t>The organisers' Policy v2.1 differs from Ryde's public Help Centre (a S$5.00 no-show fee, internal routing thresholds). We made it the governing policy, put its routing in code and re-checked every answer key against it, keeping the old ruling beside each changed key. Their three samples are right (D50).</w:t>
+      </w:r>
+    </w:p>
+    <w:p>
+      <w:pPr>
+        <w:pStyle w:val="Heading3"/>
+      </w:pPr>
+      <w:r>
+        <w:rPr/>
+        <w:t>Iteration 28 — Blind sets and a regression under v2.1 (15/10)</w:t>
+      </w:r>
+    </w:p>
+    <w:p>
+      <w:pPr/>
+      <w:r>
+        <w:rPr/>
+        <w:t>A 30-case blind set in the organisers' full format scored 25/30 and exposed two wrong payouts and a safety gap (reckless driving ruled as a fare dispute); each became a code check with a test. A 52-case regression then scored 44/52 with no wrong payout; every miss was a case sent to a person.</w:t>
+      </w:r>
+    </w:p>
+    <w:p>
+      <w:pPr>
         <w:pStyle w:val="Heading2"/>
       </w:pPr>
       <w:r>
@@ -6411,6 +6586,38 @@
     </w:p>
     <w:p>
       <w:pPr>
+        <w:pStyle w:val="Heading3"/>
+      </w:pPr>
+      <w:r>
+        <w:rPr/>
+        <w:t>Failure 15 — A refund that included tolls and time (14–15/10)</w:t>
+      </w:r>
+    </w:p>
+    <w:p>
+      <w:pPr/>
+      <w:r>
+        <w:rPr/>
+        <w:t>Twice the Judge refunded the whole fare difference on a route deviation (S$6.50 for S$3.44, S$8.06 for S$4.16), although v2.1 refunds only the excess distance fare. The amount was a record figure, so the code Judge passed it. Fix: the refund is capped in code at the excess distance fare, read from the record or computed from the distance fares and the per-km rate.</w:t>
+      </w:r>
+    </w:p>
+    <w:p>
+      <w:pPr>
+        <w:pStyle w:val="Heading3"/>
+      </w:pPr>
+      <w:r>
+        <w:rPr/>
+        <w:t>Failure 16 — A hospital that was only a place (15/10)</w:t>
+      </w:r>
+    </w:p>
+    <w:p>
+      <w:pPr/>
+      <w:r>
+        <w:rPr/>
+        <w:t>"I was in the hospital lobby" matched the safety word "hospital": the case went straight to P0 and a driver suspension was proposed. Only being taken to or admitted to hospital now counts; no earlier case relied on the bare word.</w:t>
+      </w:r>
+    </w:p>
+    <w:p>
+      <w:pPr>
         <w:pStyle w:val="Heading2"/>
       </w:pPr>
       <w:r>
@@ -7736,7 +7943,7 @@
         <w:rPr>
           <w:i w:val="0"/>
         </w:rPr>
-        <w:t>Latest (12–14/10, Cerebras gpt-oss-120b, one run per case): 102 of 133 rulings correct across seven test sets. 38 dev and held-out cases 33/38 and a first fresh blind set 16/20, both with no wrong payout; a sealed set run once 16/23 and a second fresh set 13/20, one S$8.00 wrong payout each; photo sets 8/12 (one S$100 refund on a doubted photo, then fixed) and 9/10; a cancellation-scope set 7/10 with two wrong payouts (S$5.50, S$8.00). About 98 seconds per dispute and 82% of standard disputes closed with no human on the first four sets. The earlier results below are kept for the record.</w:t>
+        <w:t>Latest (15/10, under Ryde Dispute Resolution Policy v2.1, Cerebras gpt-oss-120b, one run per case): the organisers' samples DISP-001..003 all right; blind sets 10/12 and 25/30 (the second in the organisers' full format); a regression of 52 earlier cases, keys re-checked against v2.1, 44/52 with no wrong payout, 78% of the AI-decidable disputes closed with no human, about 89 seconds each. Before v2.1 (12–14/10): 102 of 133 rulings right across seven sets. The earlier results below are kept for the record.</w:t>
       </w:r>
     </w:p>
     <w:p>

</xml_diff>

<commit_message>
docs: development log sessions 7-8, journal day 23, README, submission draft and form brought up to date with D51-D52b
</commit_message>
<xml_diff>
--- a/docs/Development_Journal.docx
+++ b/docs/Development_Journal.docx
@@ -3064,6 +3064,122 @@
       <w:r>
         <w:rPr/>
         <w:t>•  Runs moved to short foreground batches that resume where they stopped, starting from unused keys.</w:t>
+      </w:r>
+    </w:p>
+    <w:p>
+      <w:pPr>
+        <w:pStyle w:val="Heading3"/>
+      </w:pPr>
+      <w:r>
+        <w:rPr/>
+        <w:t>Day 23 — Precedent selection, notices in four languages, chat tone</w:t>
+      </w:r>
+    </w:p>
+    <w:p>
+      <w:pPr/>
+      <w:r>
+        <w:rPr/>
+        <w:t>Date: 15/10/2026</w:t>
+      </w:r>
+    </w:p>
+    <w:p>
+      <w:pPr/>
+      <w:r>
+        <w:rPr/>
+        <w:t>Objective: Make the learning loop pick the right past rulings, let both parties read the outcome in their language, read the tone of the chat without letting it decide money, and bring every document up to date for submission.</w:t>
+      </w:r>
+    </w:p>
+    <w:p>
+      <w:pPr/>
+      <w:r>
+        <w:rPr/>
+        <w:t>Work completed:</w:t>
+      </w:r>
+    </w:p>
+    <w:p>
+      <w:pPr>
+        <w:pStyle w:val="ListParagraph"/>
+      </w:pPr>
+      <w:r>
+        <w:rPr/>
+        <w:t>•  (billy) Precedents (D51): only the same dispute type, decided under the policy now in force, one per principle, most similar facts first, at most three. The Judge lists the precedents it followed in a JSON field and code keeps only ids it was shown.</w:t>
+      </w:r>
+    </w:p>
+    <w:p>
+      <w:pPr>
+        <w:pStyle w:val="ListParagraph"/>
+      </w:pPr>
+      <w:r>
+        <w:rPr/>
+        <w:t>•  (billy) A switch to run the Judge alone on a stronger model, and a provider for a self-hosted open model; both off by default. Cost per dispute and per month written up.</w:t>
+      </w:r>
+    </w:p>
+    <w:p>
+      <w:pPr>
+        <w:pStyle w:val="ListParagraph"/>
+      </w:pPr>
+      <w:r>
+        <w:rPr/>
+        <w:t>•  (billy) Notices in English, Chinese, Malay and Tamil from the dashboard, built by code from the ruling (no model call); data protection and the PDPA steps a deployment still needs.</w:t>
+      </w:r>
+    </w:p>
+    <w:p>
+      <w:pPr>
+        <w:pStyle w:val="ListParagraph"/>
+      </w:pPr>
+      <w:r>
+        <w:rPr/>
+        <w:t>•  (billy) Chat tone (D52, D52b): code labels each message, a model re-checks only doubtful ones; shown on the review desk and used for the notice opening line, never given to the advocates or the Judge. Fairness notes a ruling whose reasons lean on a party’s manner.</w:t>
+      </w:r>
+    </w:p>
+    <w:p>
+      <w:pPr>
+        <w:pStyle w:val="ListParagraph"/>
+      </w:pPr>
+      <w:r>
+        <w:rPr/>
+        <w:t>•  (billy) Secret scan of the full history (clean), old plans and unused files removed, Figure 1 redrawn, README, development log, submission draft and form updated.</w:t>
+      </w:r>
+    </w:p>
+    <w:p>
+      <w:pPr/>
+      <w:r>
+        <w:rPr/>
+        <w:t>Problems encountered:</w:t>
+      </w:r>
+    </w:p>
+    <w:p>
+      <w:pPr>
+        <w:pStyle w:val="ListParagraph"/>
+      </w:pPr>
+      <w:r>
+        <w:rPr/>
+        <w:t>•  The first word lists read "bus stop" as an objection, "!!" as anger and "can you help me claim the fee" as distress.</w:t>
+      </w:r>
+    </w:p>
+    <w:p>
+      <w:pPr>
+        <w:pStyle w:val="ListParagraph"/>
+      </w:pPr>
+      <w:r>
+        <w:rPr/>
+        <w:t>•  Code alone missed sarcasm, a negated insult and Malay frustration (28/34 on our test messages); with all messages in one chat the model read neighbouring anger into a polite thank-you and over-used "object".</w:t>
+      </w:r>
+    </w:p>
+    <w:p>
+      <w:pPr/>
+      <w:r>
+        <w:rPr/>
+        <w:t>What we did about it:</w:t>
+      </w:r>
+    </w:p>
+    <w:p>
+      <w:pPr>
+        <w:pStyle w:val="ListParagraph"/>
+      </w:pPr>
+      <w:r>
+        <w:rPr/>
+        <w:t>•  Narrowed the patterns and re-ran them over the 218 chats in our data; doubtful messages now go to the model one case at a time, with the events defined narrowly (29/34, every upset message caught).</w:t>
       </w:r>
     </w:p>
     <w:p>
@@ -5166,6 +5282,22 @@
     </w:p>
     <w:p>
       <w:pPr>
+        <w:pStyle w:val="Heading3"/>
+      </w:pPr>
+      <w:r>
+        <w:rPr/>
+        <w:t>Iteration 29 — Precedent selection and chat tone (15/10)</w:t>
+      </w:r>
+    </w:p>
+    <w:p>
+      <w:pPr/>
+      <w:r>
+        <w:rPr/>
+        <w:t>Precedents are now chosen by type, policy version and principle, and the Judge must name the ones it followed in a field code checks. Chat tone is read by code with a model check on doubtful messages; it shapes the reviewer’s view and the notice wording only. Neither changes an agent’s input today, so no paid evaluation was run; the precedent selection still has to pass the release gate before any precedent goes live.</w:t>
+      </w:r>
+    </w:p>
+    <w:p>
+      <w:pPr>
         <w:pStyle w:val="Heading2"/>
       </w:pPr>
       <w:r>
@@ -8677,6 +8809,15 @@
     </w:p>
     <w:p>
       <w:pPr>
+        <w:pStyle w:val="ListParagraph"/>
+      </w:pPr>
+      <w:r>
+        <w:rPr/>
+        <w:t>•  Read tone, do not weigh it. Who sounded angrier is not evidence; tone helps the reviewer and the wording of a notice, and the audit flags a ruling that leans on it.</w:t>
+      </w:r>
+    </w:p>
+    <w:p>
+      <w:pPr>
         <w:pStyle w:val="Heading2"/>
       </w:pPr>
       <w:r>
@@ -8729,6 +8870,14 @@
       </w:pPr>
       <w:r>
         <w:t xml:space="preserve">•  An independent auditor on a different model (e.g. Hunyuan via Tencent ADP) for errors the same model cannot see; Judge majority vote only on low-confidence cases; measure run-to-run variance of the baseline.</w:t>
+      </w:r>
+    </w:p>
+    <w:p>
+      <w:pPr>
+        <w:pStyle w:val="ListParagraph"/>
+      </w:pPr>
+      <w:r>
+        <w:t>•  Chat tone in production: a labelled blind set of real chats, distress cases first in the review queue, and drivers who often leave riders upset flagged for coaching. A measured release of the precedent selection through the evaluation gate.</w:t>
       </w:r>
     </w:p>
     <w:p>

</xml_diff>

<commit_message>
Docs: 16 Oct re-run and its wrong rulings stated next to the 15 Oct figures
README, submission form, requirements, development log, demo script, narration, recording guide
and both Word files: 45/52 on the submitted code with five wrong automatic rulings, the cause
(D59), and the next fix. The narration no longer says the remand loophole was closed.
</commit_message>
<xml_diff>
--- a/docs/Development_Journal.docx
+++ b/docs/Development_Journal.docx
@@ -3180,6 +3180,113 @@
       <w:r>
         <w:rPr/>
         <w:t>•  Narrowed the patterns and re-ran them over the 218 chats in our data; doubtful messages now go to the model one case at a time, with the events defined narrowly (29/34, every upset message caught).</w:t>
+      </w:r>
+    </w:p>
+    <w:p>
+      <w:pPr>
+        <w:pStyle w:val="Heading3"/>
+      </w:pPr>
+      <w:r>
+        <w:rPr/>
+        <w:t>Day 24 — Submission day: precedents, rate-based refunds, a full re-run</w:t>
+      </w:r>
+    </w:p>
+    <w:p>
+      <w:pPr/>
+      <w:r>
+        <w:rPr/>
+        <w:t>Date: 16/10/2026</w:t>
+      </w:r>
+    </w:p>
+    <w:p>
+      <w:pPr/>
+      <w:r>
+        <w:rPr/>
+        <w:t>Objective: Check that precedents are used, let refunds computed from a trip's rate pass the code checks, and measure the submitted code on the full regression.</w:t>
+      </w:r>
+    </w:p>
+    <w:p>
+      <w:pPr/>
+      <w:r>
+        <w:rPr/>
+        <w:t>Work completed:</w:t>
+      </w:r>
+    </w:p>
+    <w:p>
+      <w:pPr>
+        <w:pStyle w:val="ListParagraph"/>
+      </w:pPr>
+      <w:r>
+        <w:rPr/>
+        <w:t>•  (billy) Precedents (D55): the Judge never reported which precedents it followed, because its fixed list of output keys did not include them. Added; 7/7 replies now report it, one correct citation.</w:t>
+      </w:r>
+    </w:p>
+    <w:p>
+      <w:pPr>
+        <w:pStyle w:val="ListParagraph"/>
+      </w:pPr>
+      <w:r>
+        <w:rPr/>
+        <w:t>•  (billy) Photo analysis on its own key; new Cerebras and Groq keys on the server (D56).</w:t>
+      </w:r>
+    </w:p>
+    <w:p>
+      <w:pPr>
+        <w:pStyle w:val="ListParagraph"/>
+      </w:pPr>
+      <w:r>
+        <w:rPr/>
+        <w:t>•  (billy) Rate-based refunds (D57-D58): derived numbers written as arithmetic, the rule wording counted as record figures, pause lengths from the app events, floor() and min(). Five cases that went to a person now decided automatically and right; new blind sets 5/8 and 3/8.</w:t>
+      </w:r>
+    </w:p>
+    <w:p>
+      <w:pPr>
+        <w:pStyle w:val="ListParagraph"/>
+      </w:pPr>
+      <w:r>
+        <w:rPr/>
+        <w:t>•  (billy) Full regression on the submitted code (D59): 45/52, but five wrong automatic rulings.</w:t>
+      </w:r>
+    </w:p>
+    <w:p>
+      <w:pPr/>
+      <w:r>
+        <w:rPr/>
+        <w:t>Problems encountered:</w:t>
+      </w:r>
+    </w:p>
+    <w:p>
+      <w:pPr>
+        <w:pStyle w:val="ListParagraph"/>
+      </w:pPr>
+      <w:r>
+        <w:rPr/>
+        <w:t>•  A prompt line meant to stop the Judge listing facts nobody needs made it leave out the very record that had a data problem, so the Code Judge had nothing to catch.</w:t>
+      </w:r>
+    </w:p>
+    <w:p>
+      <w:pPr>
+        <w:pStyle w:val="ListParagraph"/>
+      </w:pPr>
+      <w:r>
+        <w:rPr/>
+        <w:t>•  Re-running two of those cases on the morning's code showed the same slip once in two: the 0 wrong payouts of 15/10 came from one run per case.</w:t>
+      </w:r>
+    </w:p>
+    <w:p>
+      <w:pPr/>
+      <w:r>
+        <w:rPr/>
+        <w:t>What we did about it:</w:t>
+      </w:r>
+    </w:p>
+    <w:p>
+      <w:pPr>
+        <w:pStyle w:val="ListParagraph"/>
+      </w:pPr>
+      <w:r>
+        <w:rPr/>
+        <w:t>•  Removed the line (D59), published the result, and made a code check on the questioned record itself the next fix.</w:t>
       </w:r>
     </w:p>
     <w:p>
@@ -5298,6 +5405,22 @@
     </w:p>
     <w:p>
       <w:pPr>
+        <w:pStyle w:val="Heading3"/>
+      </w:pPr>
+      <w:r>
+        <w:rPr/>
+        <w:t>Iteration 30 — Rate-based refunds and a full re-run (16/10)</w:t>
+      </w:r>
+    </w:p>
+    <w:p>
+      <w:pPr/>
+      <w:r>
+        <w:rPr/>
+        <w:t>Refunds computed from a trip's own rate (a per-minute stop credit, a per-km detour refund) now pass the code checks when the Judge writes out the arithmetic: five cases that went to a person are decided right. The full re-run then showed the cost of one prompt line and an older gap: the Code Judge only sees a doubtful record if the Judge lists it. Published with the fix plan (D59).</w:t>
+      </w:r>
+    </w:p>
+    <w:p>
+      <w:pPr>
         <w:pStyle w:val="Heading2"/>
       </w:pPr>
       <w:r>
@@ -8075,7 +8198,7 @@
         <w:rPr>
           <w:i w:val="0"/>
         </w:rPr>
-        <w:t>Latest (15/10, under Ryde Dispute Resolution Policy v2.1, Cerebras gpt-oss-120b, one run per case): the organisers' samples DISP-001..003 all right; blind sets 10/12 and 25/30 (the second in the organisers' full format); a regression of 52 earlier cases, keys re-checked against v2.1, 44/52 with no wrong payout, 78% of the AI-decidable disputes closed with no human, about 89 seconds each. Before v2.1 (12–14/10): 102 of 133 rulings right across seven sets. The earlier results below are kept for the record.</w:t>
+        <w:t>Latest (15/10, under Ryde Dispute Resolution Policy v2.1, Cerebras gpt-oss-120b, one run per case): the organisers' samples DISP-001..003 all right; blind sets 10/12 and 25/30 (the second in the organisers' full format); a regression of 52 earlier cases, keys re-checked against v2.1, 44/52 with no wrong payout, 78% of the AI-decidable disputes closed with no human, about 89 seconds each. Before v2.1 (12–14/10): 102 of 133 rulings right across seven sets. The earlier results below are kept for the record. A re-run of the 52 on the submitted code (16/10) gave 45/52, but five automatic rulings were wrong: three cases with a logged data problem that must go to a person (F2-12, F2-16, F2-17), a S$3.10 route refund (RD-002) and a short driver award (F2-15). The Code Judge catches a questioned record only when the Judge lists it; the same slip shows on the earlier code about one run in two. A prompt line from that day that made it worse is removed; the next fix checks the record in code (D59).</w:t>
       </w:r>
     </w:p>
     <w:p>
@@ -8862,6 +8985,14 @@
       </w:pPr>
       <w:r>
         <w:t>•  Photo evidence for cleaning claims is done (D46–D47); next: damage claims, a cleaning-fee dispute type, and the two open wrong payouts (a held fee in a driver's dispute, a party's own chat admission).</w:t>
+      </w:r>
+    </w:p>
+    <w:p>
+      <w:pPr>
+        <w:pStyle w:val="ListParagraph"/>
+      </w:pPr>
+      <w:r>
+        <w:t>•  A code check on the questioned record itself, so a case with a data problem cannot be paid because the Judge left that record out of its facts (D59); and code checks on money written as compensation text.</w:t>
       </w:r>
     </w:p>
     <w:p>

</xml_diff>